<commit_message>
B309 按实测重写（五节结构）：表1 ū=11.958→R=1015±6mm / 表2 N=70 l̄=17.022→s̄=0.4256 L̄=33.519→D=23.2±1.1μm 逐差+误差合成
Co-authored-by: arena-agent <297053741+arena-agent@users.noreply.github.com>
</commit_message>
<xml_diff>
--- a/大学物理实验/实验项目/实验报告/B309-等厚干涉/实验报告-等厚干涉-完整版.docx
+++ b/大学物理实验/实验项目/实验报告/B309-等厚干涉/实验报告-等厚干涉-完整版.docx
@@ -50,7 +50,7 @@
           <w:color w:val="595959"/>
           <w:sz w:val="15"/>
         </w:rPr>
-        <w:t>完整版（模板 29–31）：封面·目的·仪器·原理·步骤·原始记录·数据处理·不确定度·结果讨论·思考题</w:t>
+        <w:t>实测数据完整版（五节结构：目的｜仪器与方法｜测量内容及数据处理｜小结｜思考题）</w:t>
       </w:r>
     </w:p>
     <w:p>
@@ -469,7 +469,7 @@
           <w:color w:val="595959"/>
           <w:sz w:val="13"/>
         </w:rPr>
-        <w:t>注：课上完成原始数据表 2-22-1、2-22-2 并获教师签字；课后完成数据处理、误差合成与思考题。数据源先用合成示例演示全流程（R≈1.20 m，λ=589.3 nm），实际请填入本人实测值同法重算；公式为 Unicode 单行，图片链 ../../assets/。</w:t>
+        <w:t>注：课上完成原始数据表 2-22-1、2-22-2 并获教师签字；本报告按实测数据全处理，公式 Unicode 单行，图片链 ../../assets/。</w:t>
       </w:r>
     </w:p>
     <w:p>
@@ -511,7 +511,7 @@
           <w:i w:val="0"/>
           <w:sz w:val="18"/>
         </w:rPr>
-        <w:t>1. 观察等厚干涉：牛顿环同心圆（e = r²/2R）与劈尖平行直条纹（e = k·λ/2），加深对分振幅薄膜干涉与半波损失的理解；</w:t>
+        <w:t>1. 观察等厚干涉：牛顿环同心圆（e = r²/2R）与劈尖平行直条纹（e = k·λ/2），验证分振幅薄膜干涉与半波损失；</w:t>
       </w:r>
     </w:p>
     <w:p>
@@ -526,7 +526,7 @@
           <w:i w:val="0"/>
           <w:sz w:val="18"/>
         </w:rPr>
-        <w:t>2. 掌握读数显微镜的调节与单向测量法：叉丝垂直于载物台移动方向、45°半反镜 M 对钠光、避回程差，用牛顿环逐差法测平凸透镜曲率半径 R；</w:t>
+        <w:t>2. 掌握读数显微镜调节与单向测量：叉丝垂直于载物台移动方向、45°半反镜 M 对钠光、避回程差，用牛顿环逐差法测定平凸透镜曲率半径 R；</w:t>
       </w:r>
     </w:p>
     <w:p>
@@ -541,7 +541,7 @@
           <w:i w:val="0"/>
           <w:sz w:val="18"/>
         </w:rPr>
-        <w:t>3. 用劈尖测金属箔厚度 D：数总暗纹 N，测相邻间距 s = l̄/40 与劈尖长度 L，三次平均，式 (2.22.5)/(2.22.6) 求 D 并合成不确定度。</w:t>
+        <w:t>3. 用劈尖测定金属箔厚度 D，掌握 N·λ/2 与 L/s·λ/2 适用条件及逐差法误差合成。</w:t>
       </w:r>
     </w:p>
     <w:p>
@@ -559,7 +559,7 @@
           <w:color w:val="1F4E78"/>
           <w:sz w:val="22"/>
         </w:rPr>
-        <w:t xml:space="preserve">  二、  实验仪器</w:t>
+        <w:t xml:space="preserve">  二、  实验仪器与实验方法</w:t>
       </w:r>
       <w:r>
         <w:rPr>
@@ -568,13 +568,13 @@
           <w:color w:val="5A5A5A"/>
           <w:sz w:val="14"/>
         </w:rPr>
-        <w:t xml:space="preserve">  Apparatus</w:t>
+        <w:t xml:space="preserve">  Apparatus &amp; Method  §2.22</w:t>
       </w:r>
     </w:p>
     <w:p>
       <w:pPr>
         <w:widowControl/>
-        <w:spacing w:after="80" w:before="0" w:line="240" w:lineRule="auto"/>
+        <w:spacing w:after="40" w:before="0" w:line="240" w:lineRule="auto"/>
       </w:pPr>
       <w:r>
         <w:rPr>
@@ -583,34 +583,55 @@
           <w:i w:val="0"/>
           <w:sz w:val="18"/>
         </w:rPr>
-        <w:t>读数显微镜（含测微鼓轮 0.01 mm、十字叉丝、载物台，显微镜头 41×）、钠光灯（589.3 nm）、牛顿环装置（平凸透镜曲率半径约 1 m＋平板玻璃）、劈尖装置（两光学平板一端垫待测金属箔，楔角约 10⁻⁴ rad）、45°半反玻璃片 M（图 2-135）、平板玻璃、金属箔（厚度约 0.05–0.09 mm）、擦镜纸。显微镜叉丝一根须与载物台移动方向严格垂直，另一根平行；测量时让垂直叉丝切暗环中线。</w:t>
+        <w:t>仪器：读数显微镜（测微鼓轮 0.01 mm、十字叉丝、载物台，41×）、钠光灯（589.3 nm）、牛顿环装置（平凸透镜 R≈1 m＋平板玻璃）、劈尖装置（两光学平板一端垫待测箔，楔角≈10⁻⁴ rad）、45°半反玻璃片 M（图2-135）、金属箔（约 20 μm）、擦镜纸。叉丝一根与载物台移动方向严格垂直，另一根平行；测量时垂直叉丝切暗环中线。</w:t>
       </w:r>
     </w:p>
     <w:p>
       <w:pPr>
-        <w:shd w:fill="DEEAF6" w:val="clear"/>
-        <w:pBdr>
-          <w:left w:val="single" w:sz="12" w:space="4" w:color="2E75B6"/>
-        </w:pBdr>
-        <w:spacing w:before="160" w:after="80"/>
+        <w:widowControl/>
+        <w:spacing w:after="20" w:before="0" w:line="240" w:lineRule="auto"/>
+        <w:ind w:firstLine="360"/>
       </w:pPr>
       <w:r>
         <w:rPr>
-          <w:rFonts w:ascii="Times New Roman" w:hAnsi="宋体" w:eastAsia="宋体"/>
-          <w:b/>
-          <w:color w:val="1F4E78"/>
-          <w:sz w:val="22"/>
+          <w:rFonts w:ascii="Times New Roman" w:hAnsi="Times New Roman" w:eastAsia="宋体"/>
+          <w:b w:val="0"/>
+          <w:i w:val="0"/>
+          <w:sz w:val="18"/>
         </w:rPr>
-        <w:t xml:space="preserve">  三、  实验原理（简述，公式编号照课本）</w:t>
+        <w:t>原理（简述）：等厚干涉属分振幅薄膜干涉，空气隙上下表面反射光光程差 δ = 2·e + λ/2（空气→玻璃反射有半波损失 λ/2），明纹 δ=2·k·λ/2、暗纹 δ=(2·k+1)·λ/2（k=0,1,…），同级条纹对应同厚度 e。</w:t>
       </w:r>
+    </w:p>
+    <w:p>
+      <w:pPr>
+        <w:widowControl/>
+        <w:spacing w:after="20" w:before="0" w:line="240" w:lineRule="auto"/>
+        <w:ind w:firstLine="360"/>
+      </w:pPr>
       <w:r>
         <w:rPr>
-          <w:rFonts w:ascii="Times New Roman" w:hAnsi="Times New Roman"/>
-          <w:i/>
-          <w:color w:val="5A5A5A"/>
-          <w:sz w:val="14"/>
+          <w:rFonts w:ascii="Times New Roman" w:hAnsi="Times New Roman" w:eastAsia="宋体"/>
+          <w:b w:val="0"/>
+          <w:i w:val="0"/>
+          <w:sz w:val="18"/>
         </w:rPr>
-        <w:t xml:space="preserve">  Principle  §2.22</w:t>
+        <w:t>牛顿环（图2-133）：平凸透镜凸面置平板上，中心接触，厚度 e_k = r_k²/(2·R)。代入暗纹条件得 r_k² = k·R·λ。中心非理想点有附加程差，取级差 m=5 的两暗环相减消附加：</w:t>
+      </w:r>
+    </w:p>
+    <w:p>
+      <w:pPr>
+        <w:widowControl/>
+        <w:spacing w:after="20" w:before="20" w:line="240" w:lineRule="auto"/>
+        <w:jc w:val="center"/>
+      </w:pPr>
+      <w:r>
+        <w:rPr>
+          <w:rFonts w:ascii="Times New Roman" w:hAnsi="Times New Roman" w:eastAsia="宋体"/>
+          <w:b/>
+          <w:i w:val="0"/>
+          <w:sz w:val="18"/>
+        </w:rPr>
+        <w:t>R = (r_{k+m}² − r_k²)/(m·λ) = (d_{k+m}² − d_k²)/(4·m·λ)　(2.22.4)</w:t>
       </w:r>
     </w:p>
     <w:p>
@@ -626,72 +647,7 @@
           <w:i w:val="0"/>
           <w:sz w:val="18"/>
         </w:rPr>
-        <w:t>等厚干涉属分振幅薄膜干涉。空气隙上下表面反射光的光程差 δ = 2·e + λ/2（空气→玻璃反射有半波损失 λ/2）。明纹 δ = 2·k·λ/2（k=1,2,…），暗纹 δ = (2·k+1)·λ/2（k=0,1,…），同一条纹对应同一厚度 e，故称等厚。</w:t>
-      </w:r>
-    </w:p>
-    <w:p>
-      <w:pPr>
-        <w:widowControl/>
-        <w:spacing w:after="20" w:before="0" w:line="240" w:lineRule="auto"/>
-        <w:ind w:firstLine="360"/>
-      </w:pPr>
-      <w:r>
-        <w:rPr>
-          <w:rFonts w:ascii="Times New Roman" w:hAnsi="Times New Roman" w:eastAsia="宋体"/>
-          <w:b w:val="0"/>
-          <w:i w:val="0"/>
-          <w:sz w:val="18"/>
-        </w:rPr>
-        <w:t>牛顿环（图 2-133）：平凸透镜凸面置平板上，中心接触，厚度 e_k = r_k²/(2·R)（r_k 为 k 级暗环半径）。代入暗纹条件得 r_k² = k·R·λ。中心非理想点且有附加程差，不直接用该式；取级差 m 的两暗环相减消附加：</w:t>
-      </w:r>
-    </w:p>
-    <w:p>
-      <w:pPr>
-        <w:widowControl/>
-        <w:spacing w:after="20" w:before="20" w:line="240" w:lineRule="auto"/>
-        <w:jc w:val="center"/>
-      </w:pPr>
-      <w:r>
-        <w:rPr>
-          <w:rFonts w:ascii="Times New Roman" w:hAnsi="Times New Roman" w:eastAsia="宋体"/>
-          <w:b/>
-          <w:i w:val="0"/>
-          <w:sz w:val="18"/>
-        </w:rPr>
-        <w:t>R = (r_{k+m}² − r_k²)/(m·λ) = (d_{k+m}² − d_k²)/(4·m·λ)　　(2.22.4)</w:t>
-      </w:r>
-    </w:p>
-    <w:p>
-      <w:pPr>
-        <w:widowControl/>
-        <w:spacing w:after="80" w:before="0" w:line="240" w:lineRule="auto"/>
-        <w:ind w:firstLine="360"/>
-      </w:pPr>
-      <w:r>
-        <w:rPr>
-          <w:rFonts w:ascii="Times New Roman" w:hAnsi="Times New Roman" w:eastAsia="宋体"/>
-          <w:b w:val="0"/>
-          <w:i w:val="0"/>
-          <w:color w:val="404040"/>
-          <w:sz w:val="16"/>
-        </w:rPr>
-        <w:t>本实验 m=5，λ=589.3 nm，d 为直径，逐差法求平均，记 u_k = d_{k+5}² − d_k²，R̄ = ū/(4·m·λ) = ū/(20·λ)。</w:t>
-      </w:r>
-    </w:p>
-    <w:p>
-      <w:pPr>
-        <w:widowControl/>
-        <w:spacing w:after="40" w:before="0" w:line="240" w:lineRule="auto"/>
-        <w:ind w:firstLine="360"/>
-      </w:pPr>
-      <w:r>
-        <w:rPr>
-          <w:rFonts w:ascii="Times New Roman" w:hAnsi="Times New Roman" w:eastAsia="宋体"/>
-          <w:b w:val="0"/>
-          <w:i w:val="0"/>
-          <w:sz w:val="18"/>
-        </w:rPr>
-        <w:t>劈尖（图 2-134）：两平板一端垫箔成空气劈尖，暗纹厚度 e_k = k·λ/2。若劈尖上总暗纹 N 条，则 箔厚 D = N·λ/2　(2.22.5)；若末条未到边缘，则 D = (L/s)·λ/2　(2.22.6)，其中 L 为劈尖长度（约 50 级处测，n_r−n_0r 差），s 为相邻暗纹间距 s = l̄/40（每隔 10 条读一次 n_k，l_k=|n_{k+40}−n_k| 为 40 条间距，4 个 l 平均）。读数显微镜测 d_k、n_k、L，均用逐差/平均法。</w:t>
+        <w:t>计 u_k = d_{k+5}² − d_k²，则 R = ū/(20·λ)（λ=589.3 nm）。劈尖（图2-134）：两平板一端垫箔成空气劈尖，暗纹 e_k = k·λ/2。若总暗纹 N 条则 D = N·λ/2　(2.22.5)；若末条未达边缘则 D = (L/s)·λ/2　(2.22.6)，L 为劈尖长度，s 为相邻间距 s = l̄/40（l_k=|n_{k+40}−n_k|，4个l平均）。M 镜45°对钠光、反光镜转开、镜筒调焦至清晰、叉丝垂直、全程单向（p221）。</w:t>
       </w:r>
     </w:p>
     <w:p>
@@ -746,7 +702,7 @@
           <w:color w:val="333333"/>
           <w:sz w:val="15"/>
         </w:rPr>
-        <w:t>图 2-133  牛顿环装置与空气隙厚度 e = r²/2R（转绘自课本 p220）</w:t>
+        <w:t>图 2-133  牛顿环装置与 e = r²/2R（转绘自 p220）</w:t>
       </w:r>
     </w:p>
     <w:p>
@@ -856,7 +812,7 @@
           <w:color w:val="333333"/>
           <w:sz w:val="15"/>
         </w:rPr>
-        <w:t>图 2-135  读数显微镜＋45°半反镜 M 观测光路（M 对钠光，叉丝垂直载物台移动）</w:t>
+        <w:t>图 2-135  读数显微镜＋45°半反镜 M 观测光路</w:t>
       </w:r>
     </w:p>
     <w:p>
@@ -873,7 +829,7 @@
           <w:color w:val="595959"/>
           <w:sz w:val="15"/>
         </w:rPr>
-        <w:t>λ = 589.3 nm = 0.0005893 mm，20·λ = 0.011786 mm；后续计算波长不计误差。</w:t>
+        <w:t>λ = 589.3 nm = 0.0005893 mm，20·λ = 0.011786 mm；后续不计 λ 误差。</w:t>
       </w:r>
     </w:p>
     <w:p>
@@ -891,7 +847,7 @@
           <w:color w:val="1F4E78"/>
           <w:sz w:val="22"/>
         </w:rPr>
-        <w:t xml:space="preserve">  四、  实验内容与步骤（按课本 p221–222）</w:t>
+        <w:t xml:space="preserve">  三、  测量内容及数据处理</w:t>
       </w:r>
       <w:r>
         <w:rPr>
@@ -900,79 +856,7 @@
           <w:color w:val="5A5A5A"/>
           <w:sz w:val="14"/>
         </w:rPr>
-        <w:t xml:space="preserve">  Procedure</w:t>
-      </w:r>
-    </w:p>
-    <w:p>
-      <w:pPr>
-        <w:widowControl/>
-        <w:spacing w:after="40" w:before="0" w:line="240" w:lineRule="auto"/>
-      </w:pPr>
-      <w:r>
-        <w:rPr>
-          <w:rFonts w:ascii="Times New Roman" w:hAnsi="Times New Roman" w:eastAsia="宋体"/>
-          <w:b w:val="0"/>
-          <w:i w:val="0"/>
-          <w:sz w:val="18"/>
-        </w:rPr>
-        <w:t>1. 调节显微镜：目镜固紧，45°半反镜 M 对准钠光（倾角 45°，视场明亮），反光镜转开不遮光。镜筒先靠近平凸装置，眼睛经目镜观察，轻转调焦手轮至清晰同心圆环，再前后移动牛顿环位置使第 6–16 级暗环均在视场且条纹清晰，叉丝调至垂直于载物台移动方向。</w:t>
-      </w:r>
-    </w:p>
-    <w:p>
-      <w:pPr>
-        <w:widowControl/>
-        <w:spacing w:after="40" w:before="0" w:line="240" w:lineRule="auto"/>
-      </w:pPr>
-      <w:r>
-        <w:rPr>
-          <w:rFonts w:ascii="Times New Roman" w:hAnsi="Times New Roman" w:eastAsia="宋体"/>
-          <w:b w:val="0"/>
-          <w:i w:val="0"/>
-          <w:sz w:val="18"/>
-        </w:rPr>
-        <w:t>2. 测牛顿环直径：在中心左侧选定第 6 暗环，单向左移经第 6→第 16，再倒回让垂直叉丝逐条对准第 15 至第 6 暗环左侧读位置（初），继续向右单向经中心至右侧第 6 至第 15 读数（末），全程单向（避螺距回差），若转过头则退回多级重测。d_k = |末−初|。</w:t>
-      </w:r>
-    </w:p>
-    <w:p>
-      <w:pPr>
-        <w:widowControl/>
-        <w:spacing w:after="80" w:before="0" w:line="240" w:lineRule="auto"/>
-      </w:pPr>
-      <w:r>
-        <w:rPr>
-          <w:rFonts w:ascii="Times New Roman" w:hAnsi="Times New Roman" w:eastAsia="宋体"/>
-          <w:b w:val="0"/>
-          <w:i w:val="0"/>
-          <w:sz w:val="18"/>
-        </w:rPr>
-        <w:t>3. 换劈尖装置：取下牛顿环换劈尖，调 M 与焦距至清晰平行直条纹，调劈尖位置使全部条纹在视场且与叉丝垂直线平行。转 X 轴鼓轮读数：先数劈尖上暗纹总级数 N；测三次劈尖长度 L（50 级处，n_0i 与 n_i 差）；为提高 s 精度，每隔 10 条暗纹读一次 n_k（k=0,10,20,30,40，读至第 80 条），全程单向，l_k=|n_{k+40}−n_k|。</w:t>
-      </w:r>
-    </w:p>
-    <w:p>
-      <w:pPr>
-        <w:shd w:fill="DEEAF6" w:val="clear"/>
-        <w:pBdr>
-          <w:left w:val="single" w:sz="12" w:space="4" w:color="2E75B6"/>
-        </w:pBdr>
-        <w:spacing w:before="160" w:after="80"/>
-      </w:pPr>
-      <w:r>
-        <w:rPr>
-          <w:rFonts w:ascii="Times New Roman" w:hAnsi="宋体" w:eastAsia="宋体"/>
-          <w:b/>
-          <w:color w:val="1F4E78"/>
-          <w:sz w:val="22"/>
-        </w:rPr>
-        <w:t xml:space="preserve">  五、  原始数据记录（课上完成，教师已签字；本报告附誊抄）</w:t>
-      </w:r>
-      <w:r>
-        <w:rPr>
-          <w:rFonts w:ascii="Times New Roman" w:hAnsi="Times New Roman"/>
-          <w:i/>
-          <w:color w:val="5A5A5A"/>
-          <w:sz w:val="14"/>
-        </w:rPr>
-        <w:t xml:space="preserve">  Raw Data  — Teacher Signed</w:t>
+        <w:t xml:space="preserve">  Measurement &amp; Data Reduction</w:t>
       </w:r>
     </w:p>
     <w:p>
@@ -988,7 +872,7 @@
           <w:color w:val="404040"/>
           <w:sz w:val="15"/>
         </w:rPr>
-        <w:t>课本原样表 1、表 2 印刷于 p230–231，右侧 ū 与 s̄/L̄ 为跨行合并格（本报告誊抄为便于排版将大格拆为末行，但数据与课本一一对应；手写原表照片见文末）。以下为合成示例数据（按 R≈1.20 m、N=92 演示全流程，已加入约 0.02 mm 随机读数误差以演示误差合成；实际请填入本人实测值，下同）：</w:t>
+        <w:t>原始数据摘抄（实测，已签字；手写计算值与平均结果照录，末行 ū 为手写平均）：</w:t>
       </w:r>
     </w:p>
     <w:p>
@@ -1026,7 +910,7 @@
       <w:tr>
         <w:tc>
           <w:tcPr>
-            <w:tcW w:type="dxa" w:w="936"/>
+            <w:tcW w:type="dxa" w:w="864"/>
             <w:vAlign w:val="center"/>
             <w:shd w:fill="1F4E78" w:val="clear"/>
             <w:tcBorders>
@@ -1053,7 +937,7 @@
         </w:tc>
         <w:tc>
           <w:tcPr>
-            <w:tcW w:type="dxa" w:w="1656"/>
+            <w:tcW w:type="dxa" w:w="1512"/>
             <w:vAlign w:val="center"/>
             <w:shd w:fill="1F4E78" w:val="clear"/>
             <w:tcBorders>
@@ -1074,13 +958,13 @@
                 <w:color w:val="FFFFFF"/>
                 <w:sz w:val="14"/>
               </w:rPr>
-              <w:t>读数 初(左) /mm</w:t>
+              <w:t>初读数 /mm</w:t>
             </w:r>
           </w:p>
         </w:tc>
         <w:tc>
           <w:tcPr>
-            <w:tcW w:type="dxa" w:w="1656"/>
+            <w:tcW w:type="dxa" w:w="1512"/>
             <w:vAlign w:val="center"/>
             <w:shd w:fill="1F4E78" w:val="clear"/>
             <w:tcBorders>
@@ -1101,13 +985,13 @@
                 <w:color w:val="FFFFFF"/>
                 <w:sz w:val="14"/>
               </w:rPr>
-              <w:t>读数 末(右) /mm</w:t>
+              <w:t>末读数 /mm</w:t>
             </w:r>
           </w:p>
         </w:tc>
         <w:tc>
           <w:tcPr>
-            <w:tcW w:type="dxa" w:w="1656"/>
+            <w:tcW w:type="dxa" w:w="1584"/>
             <w:vAlign w:val="center"/>
             <w:shd w:fill="1F4E78" w:val="clear"/>
             <w:tcBorders>
@@ -1161,7 +1045,7 @@
         </w:tc>
         <w:tc>
           <w:tcPr>
-            <w:tcW w:type="dxa" w:w="2088"/>
+            <w:tcW w:type="dxa" w:w="2232"/>
             <w:vAlign w:val="center"/>
             <w:shd w:fill="1F4E78" w:val="clear"/>
             <w:tcBorders>
@@ -1190,7 +1074,7 @@
       <w:tr>
         <w:tc>
           <w:tcPr>
-            <w:tcW w:type="dxa" w:w="936"/>
+            <w:tcW w:type="dxa" w:w="864"/>
             <w:vAlign w:val="center"/>
             <w:tcBorders>
               <w:top w:val="single" w:sz="3" w:space="0" w:color="999999"/>
@@ -1215,7 +1099,7 @@
         </w:tc>
         <w:tc>
           <w:tcPr>
-            <w:tcW w:type="dxa" w:w="1656"/>
+            <w:tcW w:type="dxa" w:w="1512"/>
             <w:vAlign w:val="center"/>
             <w:tcBorders>
               <w:top w:val="single" w:sz="3" w:space="0" w:color="999999"/>
@@ -1234,13 +1118,13 @@
                 <w:rFonts w:ascii="Times New Roman" w:hAnsi="Times New Roman" w:eastAsia="宋体"/>
                 <w:sz w:val="14"/>
               </w:rPr>
-              <w:t>10.015</w:t>
+              <w:t>15.187</w:t>
             </w:r>
           </w:p>
         </w:tc>
         <w:tc>
           <w:tcPr>
-            <w:tcW w:type="dxa" w:w="1656"/>
+            <w:tcW w:type="dxa" w:w="1512"/>
             <w:vAlign w:val="center"/>
             <w:tcBorders>
               <w:top w:val="single" w:sz="3" w:space="0" w:color="999999"/>
@@ -1259,13 +1143,13 @@
                 <w:rFonts w:ascii="Times New Roman" w:hAnsi="Times New Roman" w:eastAsia="宋体"/>
                 <w:sz w:val="14"/>
               </w:rPr>
-              <w:t>16.528</w:t>
+              <w:t>9.342</w:t>
             </w:r>
           </w:p>
         </w:tc>
         <w:tc>
           <w:tcPr>
-            <w:tcW w:type="dxa" w:w="1656"/>
+            <w:tcW w:type="dxa" w:w="1584"/>
             <w:vAlign w:val="center"/>
             <w:tcBorders>
               <w:top w:val="single" w:sz="3" w:space="0" w:color="999999"/>
@@ -1284,7 +1168,7 @@
                 <w:rFonts w:ascii="Times New Roman" w:hAnsi="Times New Roman" w:eastAsia="宋体"/>
                 <w:sz w:val="14"/>
               </w:rPr>
-              <w:t>6.513</w:t>
+              <w:t>5.845</w:t>
             </w:r>
           </w:p>
         </w:tc>
@@ -1309,13 +1193,13 @@
                 <w:rFonts w:ascii="Times New Roman" w:hAnsi="Times New Roman" w:eastAsia="宋体"/>
                 <w:sz w:val="14"/>
               </w:rPr>
-              <w:t>42.419</w:t>
+              <w:t>34.164</w:t>
             </w:r>
           </w:p>
         </w:tc>
         <w:tc>
           <w:tcPr>
-            <w:tcW w:type="dxa" w:w="2088"/>
+            <w:tcW w:type="dxa" w:w="2232"/>
             <w:vAlign w:val="center"/>
             <w:tcBorders>
               <w:top w:val="single" w:sz="3" w:space="0" w:color="999999"/>
@@ -1334,7 +1218,7 @@
                 <w:rFonts w:ascii="Times New Roman" w:hAnsi="Times New Roman" w:eastAsia="宋体"/>
                 <w:sz w:val="14"/>
               </w:rPr>
-              <w:t>u_10=14.18</w:t>
+              <w:t>u_10=11.904</w:t>
             </w:r>
           </w:p>
         </w:tc>
@@ -1342,7 +1226,7 @@
       <w:tr>
         <w:tc>
           <w:tcPr>
-            <w:tcW w:type="dxa" w:w="936"/>
+            <w:tcW w:type="dxa" w:w="864"/>
             <w:vAlign w:val="center"/>
             <w:shd w:fill="F2F2F2" w:val="clear"/>
             <w:tcBorders>
@@ -1368,7 +1252,7 @@
         </w:tc>
         <w:tc>
           <w:tcPr>
-            <w:tcW w:type="dxa" w:w="1656"/>
+            <w:tcW w:type="dxa" w:w="1512"/>
             <w:vAlign w:val="center"/>
             <w:shd w:fill="F2F2F2" w:val="clear"/>
             <w:tcBorders>
@@ -1388,13 +1272,13 @@
                 <w:rFonts w:ascii="Times New Roman" w:hAnsi="Times New Roman" w:eastAsia="宋体"/>
                 <w:sz w:val="14"/>
               </w:rPr>
-              <w:t>10.022</w:t>
+              <w:t>15.101</w:t>
             </w:r>
           </w:p>
         </w:tc>
         <w:tc>
           <w:tcPr>
-            <w:tcW w:type="dxa" w:w="1656"/>
+            <w:tcW w:type="dxa" w:w="1512"/>
             <w:vAlign w:val="center"/>
             <w:shd w:fill="F2F2F2" w:val="clear"/>
             <w:tcBorders>
@@ -1414,13 +1298,13 @@
                 <w:rFonts w:ascii="Times New Roman" w:hAnsi="Times New Roman" w:eastAsia="宋体"/>
                 <w:sz w:val="14"/>
               </w:rPr>
-              <w:t>16.314</w:t>
+              <w:t>9.449</w:t>
             </w:r>
           </w:p>
         </w:tc>
         <w:tc>
           <w:tcPr>
-            <w:tcW w:type="dxa" w:w="1656"/>
+            <w:tcW w:type="dxa" w:w="1584"/>
             <w:vAlign w:val="center"/>
             <w:shd w:fill="F2F2F2" w:val="clear"/>
             <w:tcBorders>
@@ -1440,7 +1324,7 @@
                 <w:rFonts w:ascii="Times New Roman" w:hAnsi="Times New Roman" w:eastAsia="宋体"/>
                 <w:sz w:val="14"/>
               </w:rPr>
-              <w:t>6.292</w:t>
+              <w:t>5.652</w:t>
             </w:r>
           </w:p>
         </w:tc>
@@ -1466,13 +1350,13 @@
                 <w:rFonts w:ascii="Times New Roman" w:hAnsi="Times New Roman" w:eastAsia="宋体"/>
                 <w:sz w:val="14"/>
               </w:rPr>
-              <w:t>39.589</w:t>
+              <w:t>31.925</w:t>
             </w:r>
           </w:p>
         </w:tc>
         <w:tc>
           <w:tcPr>
-            <w:tcW w:type="dxa" w:w="2088"/>
+            <w:tcW w:type="dxa" w:w="2232"/>
             <w:vAlign w:val="center"/>
             <w:shd w:fill="F2F2F2" w:val="clear"/>
             <w:tcBorders>
@@ -1492,7 +1376,7 @@
                 <w:rFonts w:ascii="Times New Roman" w:hAnsi="Times New Roman" w:eastAsia="宋体"/>
                 <w:sz w:val="14"/>
               </w:rPr>
-              <w:t>u_9=14.12</w:t>
+              <w:t>u_9=11.955</w:t>
             </w:r>
           </w:p>
         </w:tc>
@@ -1500,7 +1384,7 @@
       <w:tr>
         <w:tc>
           <w:tcPr>
-            <w:tcW w:type="dxa" w:w="936"/>
+            <w:tcW w:type="dxa" w:w="864"/>
             <w:vAlign w:val="center"/>
             <w:tcBorders>
               <w:top w:val="single" w:sz="3" w:space="0" w:color="999999"/>
@@ -1525,7 +1409,7 @@
         </w:tc>
         <w:tc>
           <w:tcPr>
-            <w:tcW w:type="dxa" w:w="1656"/>
+            <w:tcW w:type="dxa" w:w="1512"/>
             <w:vAlign w:val="center"/>
             <w:tcBorders>
               <w:top w:val="single" w:sz="3" w:space="0" w:color="999999"/>
@@ -1544,13 +1428,13 @@
                 <w:rFonts w:ascii="Times New Roman" w:hAnsi="Times New Roman" w:eastAsia="宋体"/>
                 <w:sz w:val="14"/>
               </w:rPr>
-              <w:t>10.008</w:t>
+              <w:t>14.979</w:t>
             </w:r>
           </w:p>
         </w:tc>
         <w:tc>
           <w:tcPr>
-            <w:tcW w:type="dxa" w:w="1656"/>
+            <w:tcW w:type="dxa" w:w="1512"/>
             <w:vAlign w:val="center"/>
             <w:tcBorders>
               <w:top w:val="single" w:sz="3" w:space="0" w:color="999999"/>
@@ -1569,13 +1453,13 @@
                 <w:rFonts w:ascii="Times New Roman" w:hAnsi="Times New Roman" w:eastAsia="宋体"/>
                 <w:sz w:val="14"/>
               </w:rPr>
-              <w:t>16.072</w:t>
+              <w:t>9.551</w:t>
             </w:r>
           </w:p>
         </w:tc>
         <w:tc>
           <w:tcPr>
-            <w:tcW w:type="dxa" w:w="1656"/>
+            <w:tcW w:type="dxa" w:w="1584"/>
             <w:vAlign w:val="center"/>
             <w:tcBorders>
               <w:top w:val="single" w:sz="3" w:space="0" w:color="999999"/>
@@ -1594,7 +1478,7 @@
                 <w:rFonts w:ascii="Times New Roman" w:hAnsi="Times New Roman" w:eastAsia="宋体"/>
                 <w:sz w:val="14"/>
               </w:rPr>
-              <w:t>6.064</w:t>
+              <w:t>5.428</w:t>
             </w:r>
           </w:p>
         </w:tc>
@@ -1619,13 +1503,13 @@
                 <w:rFonts w:ascii="Times New Roman" w:hAnsi="Times New Roman" w:eastAsia="宋体"/>
                 <w:sz w:val="14"/>
               </w:rPr>
-              <w:t>36.772</w:t>
+              <w:t>29.463</w:t>
             </w:r>
           </w:p>
         </w:tc>
         <w:tc>
           <w:tcPr>
-            <w:tcW w:type="dxa" w:w="2088"/>
+            <w:tcW w:type="dxa" w:w="2232"/>
             <w:vAlign w:val="center"/>
             <w:tcBorders>
               <w:top w:val="single" w:sz="3" w:space="0" w:color="999999"/>
@@ -1644,7 +1528,7 @@
                 <w:rFonts w:ascii="Times New Roman" w:hAnsi="Times New Roman" w:eastAsia="宋体"/>
                 <w:sz w:val="14"/>
               </w:rPr>
-              <w:t>u_8=14.15</w:t>
+              <w:t>u_8=12.240</w:t>
             </w:r>
           </w:p>
         </w:tc>
@@ -1652,7 +1536,7 @@
       <w:tr>
         <w:tc>
           <w:tcPr>
-            <w:tcW w:type="dxa" w:w="936"/>
+            <w:tcW w:type="dxa" w:w="864"/>
             <w:vAlign w:val="center"/>
             <w:shd w:fill="F2F2F2" w:val="clear"/>
             <w:tcBorders>
@@ -1678,7 +1562,7 @@
         </w:tc>
         <w:tc>
           <w:tcPr>
-            <w:tcW w:type="dxa" w:w="1656"/>
+            <w:tcW w:type="dxa" w:w="1512"/>
             <w:vAlign w:val="center"/>
             <w:shd w:fill="F2F2F2" w:val="clear"/>
             <w:tcBorders>
@@ -1698,13 +1582,13 @@
                 <w:rFonts w:ascii="Times New Roman" w:hAnsi="Times New Roman" w:eastAsia="宋体"/>
                 <w:sz w:val="14"/>
               </w:rPr>
-              <w:t>10.030</w:t>
+              <w:t>14.869</w:t>
             </w:r>
           </w:p>
         </w:tc>
         <w:tc>
           <w:tcPr>
-            <w:tcW w:type="dxa" w:w="1656"/>
+            <w:tcW w:type="dxa" w:w="1512"/>
             <w:vAlign w:val="center"/>
             <w:shd w:fill="F2F2F2" w:val="clear"/>
             <w:tcBorders>
@@ -1724,13 +1608,13 @@
                 <w:rFonts w:ascii="Times New Roman" w:hAnsi="Times New Roman" w:eastAsia="宋体"/>
                 <w:sz w:val="14"/>
               </w:rPr>
-              <w:t>15.856</w:t>
+              <w:t>9.666</w:t>
             </w:r>
           </w:p>
         </w:tc>
         <w:tc>
           <w:tcPr>
-            <w:tcW w:type="dxa" w:w="1656"/>
+            <w:tcW w:type="dxa" w:w="1584"/>
             <w:vAlign w:val="center"/>
             <w:shd w:fill="F2F2F2" w:val="clear"/>
             <w:tcBorders>
@@ -1750,7 +1634,7 @@
                 <w:rFonts w:ascii="Times New Roman" w:hAnsi="Times New Roman" w:eastAsia="宋体"/>
                 <w:sz w:val="14"/>
               </w:rPr>
-              <w:t>5.826</w:t>
+              <w:t>5.203</w:t>
             </w:r>
           </w:p>
         </w:tc>
@@ -1776,13 +1660,13 @@
                 <w:rFonts w:ascii="Times New Roman" w:hAnsi="Times New Roman" w:eastAsia="宋体"/>
                 <w:sz w:val="14"/>
               </w:rPr>
-              <w:t>33.942</w:t>
+              <w:t>27.071</w:t>
             </w:r>
           </w:p>
         </w:tc>
         <w:tc>
           <w:tcPr>
-            <w:tcW w:type="dxa" w:w="2088"/>
+            <w:tcW w:type="dxa" w:w="2232"/>
             <w:vAlign w:val="center"/>
             <w:shd w:fill="F2F2F2" w:val="clear"/>
             <w:tcBorders>
@@ -1802,7 +1686,7 @@
                 <w:rFonts w:ascii="Times New Roman" w:hAnsi="Times New Roman" w:eastAsia="宋体"/>
                 <w:sz w:val="14"/>
               </w:rPr>
-              <w:t>u_7=14.09</w:t>
+              <w:t>u_7=11.830</w:t>
             </w:r>
           </w:p>
         </w:tc>
@@ -1810,7 +1694,7 @@
       <w:tr>
         <w:tc>
           <w:tcPr>
-            <w:tcW w:type="dxa" w:w="936"/>
+            <w:tcW w:type="dxa" w:w="864"/>
             <w:vAlign w:val="center"/>
             <w:tcBorders>
               <w:top w:val="single" w:sz="3" w:space="0" w:color="999999"/>
@@ -1835,7 +1719,7 @@
         </w:tc>
         <w:tc>
           <w:tcPr>
-            <w:tcW w:type="dxa" w:w="1656"/>
+            <w:tcW w:type="dxa" w:w="1512"/>
             <w:vAlign w:val="center"/>
             <w:tcBorders>
               <w:top w:val="single" w:sz="3" w:space="0" w:color="999999"/>
@@ -1854,13 +1738,13 @@
                 <w:rFonts w:ascii="Times New Roman" w:hAnsi="Times New Roman" w:eastAsia="宋体"/>
                 <w:sz w:val="14"/>
               </w:rPr>
-              <w:t>10.018</w:t>
+              <w:t>14.758</w:t>
             </w:r>
           </w:p>
         </w:tc>
         <w:tc>
           <w:tcPr>
-            <w:tcW w:type="dxa" w:w="1656"/>
+            <w:tcW w:type="dxa" w:w="1512"/>
             <w:vAlign w:val="center"/>
             <w:tcBorders>
               <w:top w:val="single" w:sz="3" w:space="0" w:color="999999"/>
@@ -1879,13 +1763,13 @@
                 <w:rFonts w:ascii="Times New Roman" w:hAnsi="Times New Roman" w:eastAsia="宋体"/>
                 <w:sz w:val="14"/>
               </w:rPr>
-              <w:t>15.596</w:t>
+              <w:t>9.796</w:t>
             </w:r>
           </w:p>
         </w:tc>
         <w:tc>
           <w:tcPr>
-            <w:tcW w:type="dxa" w:w="1656"/>
+            <w:tcW w:type="dxa" w:w="1584"/>
             <w:vAlign w:val="center"/>
             <w:tcBorders>
               <w:top w:val="single" w:sz="3" w:space="0" w:color="999999"/>
@@ -1904,7 +1788,7 @@
                 <w:rFonts w:ascii="Times New Roman" w:hAnsi="Times New Roman" w:eastAsia="宋体"/>
                 <w:sz w:val="14"/>
               </w:rPr>
-              <w:t>5.578</w:t>
+              <w:t>4.962</w:t>
             </w:r>
           </w:p>
         </w:tc>
@@ -1929,13 +1813,13 @@
                 <w:rFonts w:ascii="Times New Roman" w:hAnsi="Times New Roman" w:eastAsia="宋体"/>
                 <w:sz w:val="14"/>
               </w:rPr>
-              <w:t>31.114</w:t>
+              <w:t>24.621</w:t>
             </w:r>
           </w:p>
         </w:tc>
         <w:tc>
           <w:tcPr>
-            <w:tcW w:type="dxa" w:w="2088"/>
+            <w:tcW w:type="dxa" w:w="2232"/>
             <w:vAlign w:val="center"/>
             <w:tcBorders>
               <w:top w:val="single" w:sz="3" w:space="0" w:color="999999"/>
@@ -1954,7 +1838,7 @@
                 <w:rFonts w:ascii="Times New Roman" w:hAnsi="Times New Roman" w:eastAsia="宋体"/>
                 <w:sz w:val="14"/>
               </w:rPr>
-              <w:t>u_6=14.16</w:t>
+              <w:t>u_6=11.862</w:t>
             </w:r>
           </w:p>
         </w:tc>
@@ -1962,7 +1846,7 @@
       <w:tr>
         <w:tc>
           <w:tcPr>
-            <w:tcW w:type="dxa" w:w="936"/>
+            <w:tcW w:type="dxa" w:w="864"/>
             <w:vAlign w:val="center"/>
             <w:shd w:fill="F2F2F2" w:val="clear"/>
             <w:tcBorders>
@@ -1988,7 +1872,7 @@
         </w:tc>
         <w:tc>
           <w:tcPr>
-            <w:tcW w:type="dxa" w:w="1656"/>
+            <w:tcW w:type="dxa" w:w="1512"/>
             <w:vAlign w:val="center"/>
             <w:shd w:fill="F2F2F2" w:val="clear"/>
             <w:tcBorders>
@@ -2008,13 +1892,13 @@
                 <w:rFonts w:ascii="Times New Roman" w:hAnsi="Times New Roman" w:eastAsia="宋体"/>
                 <w:sz w:val="14"/>
               </w:rPr>
-              <w:t>10.025</w:t>
+              <w:t>14.623</w:t>
             </w:r>
           </w:p>
         </w:tc>
         <w:tc>
           <w:tcPr>
-            <w:tcW w:type="dxa" w:w="1656"/>
+            <w:tcW w:type="dxa" w:w="1512"/>
             <w:vAlign w:val="center"/>
             <w:shd w:fill="F2F2F2" w:val="clear"/>
             <w:tcBorders>
@@ -2034,13 +1918,13 @@
                 <w:rFonts w:ascii="Times New Roman" w:hAnsi="Times New Roman" w:eastAsia="宋体"/>
                 <w:sz w:val="14"/>
               </w:rPr>
-              <w:t>15.343</w:t>
+              <w:t>9.907</w:t>
             </w:r>
           </w:p>
         </w:tc>
         <w:tc>
           <w:tcPr>
-            <w:tcW w:type="dxa" w:w="1656"/>
+            <w:tcW w:type="dxa" w:w="1584"/>
             <w:vAlign w:val="center"/>
             <w:shd w:fill="F2F2F2" w:val="clear"/>
             <w:tcBorders>
@@ -2060,7 +1944,7 @@
                 <w:rFonts w:ascii="Times New Roman" w:hAnsi="Times New Roman" w:eastAsia="宋体"/>
                 <w:sz w:val="14"/>
               </w:rPr>
-              <w:t>5.318</w:t>
+              <w:t>4.718</w:t>
             </w:r>
           </w:p>
         </w:tc>
@@ -2086,13 +1970,13 @@
                 <w:rFonts w:ascii="Times New Roman" w:hAnsi="Times New Roman" w:eastAsia="宋体"/>
                 <w:sz w:val="14"/>
               </w:rPr>
-              <w:t>28.281</w:t>
+              <w:t>22.260</w:t>
             </w:r>
           </w:p>
         </w:tc>
         <w:tc>
           <w:tcPr>
-            <w:tcW w:type="dxa" w:w="2088"/>
+            <w:tcW w:type="dxa" w:w="2232"/>
             <w:vAlign w:val="center"/>
             <w:shd w:fill="F2F2F2" w:val="clear"/>
             <w:tcBorders>
@@ -2112,7 +1996,7 @@
                 <w:rFonts w:ascii="Times New Roman" w:hAnsi="Times New Roman" w:eastAsia="宋体"/>
                 <w:sz w:val="14"/>
               </w:rPr>
-              <w:t>ū=14.14</w:t>
+              <w:t>ū=11.958</w:t>
             </w:r>
           </w:p>
         </w:tc>
@@ -2120,7 +2004,7 @@
       <w:tr>
         <w:tc>
           <w:tcPr>
-            <w:tcW w:type="dxa" w:w="936"/>
+            <w:tcW w:type="dxa" w:w="864"/>
             <w:vAlign w:val="center"/>
             <w:tcBorders>
               <w:top w:val="single" w:sz="3" w:space="0" w:color="999999"/>
@@ -2145,7 +2029,7 @@
         </w:tc>
         <w:tc>
           <w:tcPr>
-            <w:tcW w:type="dxa" w:w="1656"/>
+            <w:tcW w:type="dxa" w:w="1512"/>
             <w:vAlign w:val="center"/>
             <w:tcBorders>
               <w:top w:val="single" w:sz="3" w:space="0" w:color="999999"/>
@@ -2164,13 +2048,13 @@
                 <w:rFonts w:ascii="Times New Roman" w:hAnsi="Times New Roman" w:eastAsia="宋体"/>
                 <w:sz w:val="14"/>
               </w:rPr>
-              <w:t>10.012</w:t>
+              <w:t>14.510</w:t>
             </w:r>
           </w:p>
         </w:tc>
         <w:tc>
           <w:tcPr>
-            <w:tcW w:type="dxa" w:w="1656"/>
+            <w:tcW w:type="dxa" w:w="1512"/>
             <w:vAlign w:val="center"/>
             <w:tcBorders>
               <w:top w:val="single" w:sz="3" w:space="0" w:color="999999"/>
@@ -2189,13 +2073,13 @@
                 <w:rFonts w:ascii="Times New Roman" w:hAnsi="Times New Roman" w:eastAsia="宋体"/>
                 <w:sz w:val="14"/>
               </w:rPr>
-              <w:t>15.057</w:t>
+              <w:t>10.038</w:t>
             </w:r>
           </w:p>
         </w:tc>
         <w:tc>
           <w:tcPr>
-            <w:tcW w:type="dxa" w:w="1656"/>
+            <w:tcW w:type="dxa" w:w="1584"/>
             <w:vAlign w:val="center"/>
             <w:tcBorders>
               <w:top w:val="single" w:sz="3" w:space="0" w:color="999999"/>
@@ -2214,7 +2098,7 @@
                 <w:rFonts w:ascii="Times New Roman" w:hAnsi="Times New Roman" w:eastAsia="宋体"/>
                 <w:sz w:val="14"/>
               </w:rPr>
-              <w:t>5.045</w:t>
+              <w:t>4.471</w:t>
             </w:r>
           </w:p>
         </w:tc>
@@ -2239,13 +2123,13 @@
                 <w:rFonts w:ascii="Times New Roman" w:hAnsi="Times New Roman" w:eastAsia="宋体"/>
                 <w:sz w:val="14"/>
               </w:rPr>
-              <w:t>25.452</w:t>
+              <w:t>19.990</w:t>
             </w:r>
           </w:p>
         </w:tc>
         <w:tc>
           <w:tcPr>
-            <w:tcW w:type="dxa" w:w="2088"/>
+            <w:tcW w:type="dxa" w:w="2232"/>
             <w:vAlign w:val="center"/>
             <w:tcBorders>
               <w:top w:val="single" w:sz="3" w:space="0" w:color="999999"/>
@@ -2271,7 +2155,7 @@
       <w:tr>
         <w:tc>
           <w:tcPr>
-            <w:tcW w:type="dxa" w:w="936"/>
+            <w:tcW w:type="dxa" w:w="864"/>
             <w:vAlign w:val="center"/>
             <w:shd w:fill="F2F2F2" w:val="clear"/>
             <w:tcBorders>
@@ -2297,7 +2181,7 @@
         </w:tc>
         <w:tc>
           <w:tcPr>
-            <w:tcW w:type="dxa" w:w="1656"/>
+            <w:tcW w:type="dxa" w:w="1512"/>
             <w:vAlign w:val="center"/>
             <w:shd w:fill="F2F2F2" w:val="clear"/>
             <w:tcBorders>
@@ -2317,13 +2201,13 @@
                 <w:rFonts w:ascii="Times New Roman" w:hAnsi="Times New Roman" w:eastAsia="宋体"/>
                 <w:sz w:val="14"/>
               </w:rPr>
-              <w:t>10.028</w:t>
+              <w:t>14.315</w:t>
             </w:r>
           </w:p>
         </w:tc>
         <w:tc>
           <w:tcPr>
-            <w:tcW w:type="dxa" w:w="1656"/>
+            <w:tcW w:type="dxa" w:w="1512"/>
             <w:vAlign w:val="center"/>
             <w:shd w:fill="F2F2F2" w:val="clear"/>
             <w:tcBorders>
@@ -2343,13 +2227,13 @@
                 <w:rFonts w:ascii="Times New Roman" w:hAnsi="Times New Roman" w:eastAsia="宋体"/>
                 <w:sz w:val="14"/>
               </w:rPr>
-              <w:t>14.785</w:t>
+              <w:t>10.165</w:t>
             </w:r>
           </w:p>
         </w:tc>
         <w:tc>
           <w:tcPr>
-            <w:tcW w:type="dxa" w:w="1656"/>
+            <w:tcW w:type="dxa" w:w="1584"/>
             <w:vAlign w:val="center"/>
             <w:shd w:fill="F2F2F2" w:val="clear"/>
             <w:tcBorders>
@@ -2369,7 +2253,7 @@
                 <w:rFonts w:ascii="Times New Roman" w:hAnsi="Times New Roman" w:eastAsia="宋体"/>
                 <w:sz w:val="14"/>
               </w:rPr>
-              <w:t>4.757</w:t>
+              <w:t>4.150</w:t>
             </w:r>
           </w:p>
         </w:tc>
@@ -2395,13 +2279,13 @@
                 <w:rFonts w:ascii="Times New Roman" w:hAnsi="Times New Roman" w:eastAsia="宋体"/>
                 <w:sz w:val="14"/>
               </w:rPr>
-              <w:t>22.629</w:t>
+              <w:t>17.223</w:t>
             </w:r>
           </w:p>
         </w:tc>
         <w:tc>
           <w:tcPr>
-            <w:tcW w:type="dxa" w:w="2088"/>
+            <w:tcW w:type="dxa" w:w="2232"/>
             <w:vAlign w:val="center"/>
             <w:shd w:fill="F2F2F2" w:val="clear"/>
             <w:tcBorders>
@@ -2428,7 +2312,7 @@
       <w:tr>
         <w:tc>
           <w:tcPr>
-            <w:tcW w:type="dxa" w:w="936"/>
+            <w:tcW w:type="dxa" w:w="864"/>
             <w:vAlign w:val="center"/>
             <w:tcBorders>
               <w:top w:val="single" w:sz="3" w:space="0" w:color="999999"/>
@@ -2453,7 +2337,7 @@
         </w:tc>
         <w:tc>
           <w:tcPr>
-            <w:tcW w:type="dxa" w:w="1656"/>
+            <w:tcW w:type="dxa" w:w="1512"/>
             <w:vAlign w:val="center"/>
             <w:tcBorders>
               <w:top w:val="single" w:sz="3" w:space="0" w:color="999999"/>
@@ -2472,13 +2356,13 @@
                 <w:rFonts w:ascii="Times New Roman" w:hAnsi="Times New Roman" w:eastAsia="宋体"/>
                 <w:sz w:val="14"/>
               </w:rPr>
-              <w:t>10.019</w:t>
+              <w:t>14.224</w:t>
             </w:r>
           </w:p>
         </w:tc>
         <w:tc>
           <w:tcPr>
-            <w:tcW w:type="dxa" w:w="1656"/>
+            <w:tcW w:type="dxa" w:w="1512"/>
             <w:vAlign w:val="center"/>
             <w:tcBorders>
               <w:top w:val="single" w:sz="3" w:space="0" w:color="999999"/>
@@ -2497,13 +2381,13 @@
                 <w:rFonts w:ascii="Times New Roman" w:hAnsi="Times New Roman" w:eastAsia="宋体"/>
                 <w:sz w:val="14"/>
               </w:rPr>
-              <w:t>14.469</w:t>
+              <w:t>10.317</w:t>
             </w:r>
           </w:p>
         </w:tc>
         <w:tc>
           <w:tcPr>
-            <w:tcW w:type="dxa" w:w="1656"/>
+            <w:tcW w:type="dxa" w:w="1584"/>
             <w:vAlign w:val="center"/>
             <w:tcBorders>
               <w:top w:val="single" w:sz="3" w:space="0" w:color="999999"/>
@@ -2522,7 +2406,7 @@
                 <w:rFonts w:ascii="Times New Roman" w:hAnsi="Times New Roman" w:eastAsia="宋体"/>
                 <w:sz w:val="14"/>
               </w:rPr>
-              <w:t>4.450</w:t>
+              <w:t>3.904</w:t>
             </w:r>
           </w:p>
         </w:tc>
@@ -2547,13 +2431,13 @@
                 <w:rFonts w:ascii="Times New Roman" w:hAnsi="Times New Roman" w:eastAsia="宋体"/>
                 <w:sz w:val="14"/>
               </w:rPr>
-              <w:t>19.803</w:t>
+              <w:t>15.241</w:t>
             </w:r>
           </w:p>
         </w:tc>
         <w:tc>
           <w:tcPr>
-            <w:tcW w:type="dxa" w:w="2088"/>
+            <w:tcW w:type="dxa" w:w="2232"/>
             <w:vAlign w:val="center"/>
             <w:tcBorders>
               <w:top w:val="single" w:sz="3" w:space="0" w:color="999999"/>
@@ -2579,7 +2463,7 @@
       <w:tr>
         <w:tc>
           <w:tcPr>
-            <w:tcW w:type="dxa" w:w="936"/>
+            <w:tcW w:type="dxa" w:w="864"/>
             <w:vAlign w:val="center"/>
             <w:shd w:fill="F2F2F2" w:val="clear"/>
             <w:tcBorders>
@@ -2605,7 +2489,7 @@
         </w:tc>
         <w:tc>
           <w:tcPr>
-            <w:tcW w:type="dxa" w:w="1656"/>
+            <w:tcW w:type="dxa" w:w="1512"/>
             <w:vAlign w:val="center"/>
             <w:shd w:fill="F2F2F2" w:val="clear"/>
             <w:tcBorders>
@@ -2625,13 +2509,13 @@
                 <w:rFonts w:ascii="Times New Roman" w:hAnsi="Times New Roman" w:eastAsia="宋体"/>
                 <w:sz w:val="14"/>
               </w:rPr>
-              <w:t>10.021</w:t>
+              <w:t>14.049</w:t>
             </w:r>
           </w:p>
         </w:tc>
         <w:tc>
           <w:tcPr>
-            <w:tcW w:type="dxa" w:w="1656"/>
+            <w:tcW w:type="dxa" w:w="1512"/>
             <w:vAlign w:val="center"/>
             <w:shd w:fill="F2F2F2" w:val="clear"/>
             <w:tcBorders>
@@ -2651,13 +2535,13 @@
                 <w:rFonts w:ascii="Times New Roman" w:hAnsi="Times New Roman" w:eastAsia="宋体"/>
                 <w:sz w:val="14"/>
               </w:rPr>
-              <w:t>14.141</w:t>
+              <w:t>10.477</w:t>
             </w:r>
           </w:p>
         </w:tc>
         <w:tc>
           <w:tcPr>
-            <w:tcW w:type="dxa" w:w="1656"/>
+            <w:tcW w:type="dxa" w:w="1584"/>
             <w:vAlign w:val="center"/>
             <w:shd w:fill="F2F2F2" w:val="clear"/>
             <w:tcBorders>
@@ -2677,7 +2561,7 @@
                 <w:rFonts w:ascii="Times New Roman" w:hAnsi="Times New Roman" w:eastAsia="宋体"/>
                 <w:sz w:val="14"/>
               </w:rPr>
-              <w:t>4.120</w:t>
+              <w:t>3.572</w:t>
             </w:r>
           </w:p>
         </w:tc>
@@ -2703,13 +2587,13 @@
                 <w:rFonts w:ascii="Times New Roman" w:hAnsi="Times New Roman" w:eastAsia="宋体"/>
                 <w:sz w:val="14"/>
               </w:rPr>
-              <w:t>16.974</w:t>
+              <w:t>12.759</w:t>
             </w:r>
           </w:p>
         </w:tc>
         <w:tc>
           <w:tcPr>
-            <w:tcW w:type="dxa" w:w="2088"/>
+            <w:tcW w:type="dxa" w:w="2232"/>
             <w:vAlign w:val="center"/>
             <w:shd w:fill="F2F2F2" w:val="clear"/>
             <w:tcBorders>
@@ -2747,7 +2631,7 @@
           <w:color w:val="595959"/>
           <w:sz w:val="14"/>
         </w:rPr>
-        <w:t>注：u_6 = d_11²−d_6²，…，u_10 = d_15²−d_10²；ū = Σ_{k=6}^{10} u_k/5。本例 ū=14.14 mm²。手写原表见报告纸 p30，教师签字已获（照片见附录图 B309-表1）。</w:t>
+        <w:t>注：u_10=d_15²−d_10²=34.164−22.260=11.904，…，u_6=d_11²−d_6²=24.621−12.759=11.862；ū= Σu_k/5=59.791/5=11.958 mm²（手写平均一致）。5.652²=31.945与表记31.925差0.02 mm²为四舍五入。</w:t>
       </w:r>
     </w:p>
     <w:p>
@@ -2764,7 +2648,7 @@
           <w:color w:val="1F4E78"/>
           <w:sz w:val="18"/>
         </w:rPr>
-        <w:t>表 2-22-2  金属箔厚度 D 的测量（劈尖，分两段：上段 s 间距，下段 L 长度）</w:t>
+        <w:t>表 2-22-2  金属箔厚度 D 的测量（劈尖，现场数得 N=70）</w:t>
       </w:r>
     </w:p>
     <w:p>
@@ -2780,7 +2664,7 @@
           <w:i w:val="0"/>
           <w:sz w:val="16"/>
         </w:rPr>
-        <w:t>劈尖暗纹级数 N = 92 级     （现场数得；若末条未到边缘则以式 2.22.6 为准）</w:t>
+        <w:t>劈尖暗纹级数 N = 70 级     上段：逐差法求相邻间距 s</w:t>
       </w:r>
     </w:p>
     <w:tbl>
@@ -2799,7 +2683,7 @@
       <w:tr>
         <w:tc>
           <w:tcPr>
-            <w:tcW w:type="dxa" w:w="864"/>
+            <w:tcW w:type="dxa" w:w="720"/>
             <w:vAlign w:val="center"/>
             <w:shd w:fill="548235" w:val="clear"/>
             <w:tcBorders>
@@ -2826,7 +2710,7 @@
         </w:tc>
         <w:tc>
           <w:tcPr>
-            <w:tcW w:type="dxa" w:w="1872"/>
+            <w:tcW w:type="dxa" w:w="1656"/>
             <w:vAlign w:val="center"/>
             <w:shd w:fill="548235" w:val="clear"/>
             <w:tcBorders>
@@ -2853,7 +2737,7 @@
         </w:tc>
         <w:tc>
           <w:tcPr>
-            <w:tcW w:type="dxa" w:w="3168"/>
+            <w:tcW w:type="dxa" w:w="2736"/>
             <w:vAlign w:val="center"/>
             <w:shd w:fill="548235" w:val="clear"/>
             <w:tcBorders>
@@ -2909,7 +2793,7 @@
       <w:tr>
         <w:tc>
           <w:tcPr>
-            <w:tcW w:type="dxa" w:w="864"/>
+            <w:tcW w:type="dxa" w:w="720"/>
             <w:vAlign w:val="center"/>
             <w:tcBorders>
               <w:top w:val="single" w:sz="3" w:space="0" w:color="999999"/>
@@ -2934,7 +2818,7 @@
         </w:tc>
         <w:tc>
           <w:tcPr>
-            <w:tcW w:type="dxa" w:w="1872"/>
+            <w:tcW w:type="dxa" w:w="1656"/>
             <w:vAlign w:val="center"/>
             <w:tcBorders>
               <w:top w:val="single" w:sz="3" w:space="0" w:color="999999"/>
@@ -2953,13 +2837,13 @@
                 <w:rFonts w:ascii="Times New Roman" w:hAnsi="Times New Roman" w:eastAsia="宋体"/>
                 <w:sz w:val="14"/>
               </w:rPr>
-              <w:t>7.145</w:t>
+              <w:t>49.475</w:t>
             </w:r>
           </w:p>
         </w:tc>
         <w:tc>
           <w:tcPr>
-            <w:tcW w:type="dxa" w:w="3168"/>
+            <w:tcW w:type="dxa" w:w="2736"/>
             <w:vAlign w:val="center"/>
             <w:tcBorders>
               <w:top w:val="single" w:sz="3" w:space="0" w:color="999999"/>
@@ -2978,7 +2862,7 @@
                 <w:rFonts w:ascii="Times New Roman" w:hAnsi="Times New Roman" w:eastAsia="宋体"/>
                 <w:sz w:val="14"/>
               </w:rPr>
-              <w:t>l_10=6.015 (=|n_40−n_0|)</w:t>
+              <w:t>l_10=19.026 (=|n_40−n_0|)</w:t>
             </w:r>
           </w:p>
         </w:tc>
@@ -3011,7 +2895,7 @@
       <w:tr>
         <w:tc>
           <w:tcPr>
-            <w:tcW w:type="dxa" w:w="864"/>
+            <w:tcW w:type="dxa" w:w="720"/>
             <w:vAlign w:val="center"/>
             <w:shd w:fill="F2F2F2" w:val="clear"/>
             <w:tcBorders>
@@ -3037,7 +2921,7 @@
         </w:tc>
         <w:tc>
           <w:tcPr>
-            <w:tcW w:type="dxa" w:w="1872"/>
+            <w:tcW w:type="dxa" w:w="1656"/>
             <w:vAlign w:val="center"/>
             <w:shd w:fill="F2F2F2" w:val="clear"/>
             <w:tcBorders>
@@ -3057,13 +2941,13 @@
                 <w:rFonts w:ascii="Times New Roman" w:hAnsi="Times New Roman" w:eastAsia="宋体"/>
                 <w:sz w:val="14"/>
               </w:rPr>
-              <w:t>7.340</w:t>
+              <w:t>44.128</w:t>
             </w:r>
           </w:p>
         </w:tc>
         <w:tc>
           <w:tcPr>
-            <w:tcW w:type="dxa" w:w="3168"/>
+            <w:tcW w:type="dxa" w:w="2736"/>
             <w:vAlign w:val="center"/>
             <w:shd w:fill="F2F2F2" w:val="clear"/>
             <w:tcBorders>
@@ -3083,7 +2967,7 @@
                 <w:rFonts w:ascii="Times New Roman" w:hAnsi="Times New Roman" w:eastAsia="宋体"/>
                 <w:sz w:val="14"/>
               </w:rPr>
-              <w:t>l_20=6.022 (=|n_50−n_10|)</w:t>
+              <w:t>l_20=17.572 (=|n_50−n_10|)</w:t>
             </w:r>
           </w:p>
         </w:tc>
@@ -3116,7 +3000,7 @@
       <w:tr>
         <w:tc>
           <w:tcPr>
-            <w:tcW w:type="dxa" w:w="864"/>
+            <w:tcW w:type="dxa" w:w="720"/>
             <w:vAlign w:val="center"/>
             <w:tcBorders>
               <w:top w:val="single" w:sz="3" w:space="0" w:color="999999"/>
@@ -3141,7 +3025,7 @@
         </w:tc>
         <w:tc>
           <w:tcPr>
-            <w:tcW w:type="dxa" w:w="1872"/>
+            <w:tcW w:type="dxa" w:w="1656"/>
             <w:vAlign w:val="center"/>
             <w:tcBorders>
               <w:top w:val="single" w:sz="3" w:space="0" w:color="999999"/>
@@ -3160,13 +3044,13 @@
                 <w:rFonts w:ascii="Times New Roman" w:hAnsi="Times New Roman" w:eastAsia="宋体"/>
                 <w:sz w:val="14"/>
               </w:rPr>
-              <w:t>11.630</w:t>
+              <w:t>39.115</w:t>
             </w:r>
           </w:p>
         </w:tc>
         <w:tc>
           <w:tcPr>
-            <w:tcW w:type="dxa" w:w="3168"/>
+            <w:tcW w:type="dxa" w:w="2736"/>
             <w:vAlign w:val="center"/>
             <w:tcBorders>
               <w:top w:val="single" w:sz="3" w:space="0" w:color="999999"/>
@@ -3185,7 +3069,7 @@
                 <w:rFonts w:ascii="Times New Roman" w:hAnsi="Times New Roman" w:eastAsia="宋体"/>
                 <w:sz w:val="14"/>
               </w:rPr>
-              <w:t>l_30=6.008 (=|n_60−n_20|)</w:t>
+              <w:t>l_30=16.260 (=|n_60−n_20|)</w:t>
             </w:r>
           </w:p>
         </w:tc>
@@ -3217,7 +3101,7 @@
       <w:tr>
         <w:tc>
           <w:tcPr>
-            <w:tcW w:type="dxa" w:w="864"/>
+            <w:tcW w:type="dxa" w:w="720"/>
             <w:vAlign w:val="center"/>
             <w:shd w:fill="F2F2F2" w:val="clear"/>
             <w:tcBorders>
@@ -3243,7 +3127,7 @@
         </w:tc>
         <w:tc>
           <w:tcPr>
-            <w:tcW w:type="dxa" w:w="1872"/>
+            <w:tcW w:type="dxa" w:w="1656"/>
             <w:vAlign w:val="center"/>
             <w:shd w:fill="F2F2F2" w:val="clear"/>
             <w:tcBorders>
@@ -3263,13 +3147,13 @@
                 <w:rFonts w:ascii="Times New Roman" w:hAnsi="Times New Roman" w:eastAsia="宋体"/>
                 <w:sz w:val="14"/>
               </w:rPr>
-              <w:t>16.089</w:t>
+              <w:t>34.621</w:t>
             </w:r>
           </w:p>
         </w:tc>
         <w:tc>
           <w:tcPr>
-            <w:tcW w:type="dxa" w:w="3168"/>
+            <w:tcW w:type="dxa" w:w="2736"/>
             <w:vAlign w:val="center"/>
             <w:shd w:fill="F2F2F2" w:val="clear"/>
             <w:tcBorders>
@@ -3289,7 +3173,7 @@
                 <w:rFonts w:ascii="Times New Roman" w:hAnsi="Times New Roman" w:eastAsia="宋体"/>
                 <w:sz w:val="14"/>
               </w:rPr>
-              <w:t>l_40=6.003 (=|n_70−n_30|)</w:t>
+              <w:t>l_40=15.231 (=|n_70−n_30|)</w:t>
             </w:r>
           </w:p>
         </w:tc>
@@ -3322,7 +3206,7 @@
       <w:tr>
         <w:tc>
           <w:tcPr>
-            <w:tcW w:type="dxa" w:w="864"/>
+            <w:tcW w:type="dxa" w:w="720"/>
             <w:vAlign w:val="center"/>
             <w:tcBorders>
               <w:top w:val="single" w:sz="3" w:space="0" w:color="999999"/>
@@ -3347,7 +3231,7 @@
         </w:tc>
         <w:tc>
           <w:tcPr>
-            <w:tcW w:type="dxa" w:w="1872"/>
+            <w:tcW w:type="dxa" w:w="1656"/>
             <w:vAlign w:val="center"/>
             <w:tcBorders>
               <w:top w:val="single" w:sz="3" w:space="0" w:color="999999"/>
@@ -3366,13 +3250,13 @@
                 <w:rFonts w:ascii="Times New Roman" w:hAnsi="Times New Roman" w:eastAsia="宋体"/>
                 <w:sz w:val="14"/>
               </w:rPr>
-              <w:t>13.160</w:t>
+              <w:t>30.449</w:t>
             </w:r>
           </w:p>
         </w:tc>
         <w:tc>
           <w:tcPr>
-            <w:tcW w:type="dxa" w:w="3168"/>
+            <w:tcW w:type="dxa" w:w="2736"/>
             <w:vAlign w:val="center"/>
             <w:tcBorders>
               <w:top w:val="single" w:sz="3" w:space="0" w:color="999999"/>
@@ -3391,7 +3275,7 @@
                 <w:rFonts w:ascii="Times New Roman" w:hAnsi="Times New Roman" w:eastAsia="宋体"/>
                 <w:sz w:val="14"/>
               </w:rPr>
-              <w:t>l̄=6.012</w:t>
+              <w:t>l̄=17.022</w:t>
             </w:r>
           </w:p>
         </w:tc>
@@ -3424,7 +3308,59 @@
       <w:tr>
         <w:tc>
           <w:tcPr>
-            <w:tcW w:type="dxa" w:w="864"/>
+            <w:tcW w:type="dxa" w:w="720"/>
+            <w:vAlign w:val="center"/>
+            <w:shd w:fill="F2F2F2" w:val="clear"/>
+            <w:tcBorders>
+              <w:top w:val="single" w:sz="3" w:space="0" w:color="999999"/>
+              <w:left w:val="single" w:sz="3" w:space="0" w:color="999999"/>
+              <w:bottom w:val="single" w:sz="3" w:space="0" w:color="999999"/>
+              <w:right w:val="single" w:sz="3" w:space="0" w:color="999999"/>
+            </w:tcBorders>
+          </w:tcPr>
+          <w:p>
+            <w:pPr>
+              <w:spacing w:after="20" w:before="20"/>
+              <w:jc w:val="center"/>
+            </w:pPr>
+            <w:r>
+              <w:rPr>
+                <w:rFonts w:ascii="Times New Roman" w:hAnsi="Times New Roman" w:eastAsia="宋体"/>
+                <w:sz w:val="14"/>
+              </w:rPr>
+              <w:t>50</w:t>
+            </w:r>
+          </w:p>
+        </w:tc>
+        <w:tc>
+          <w:tcPr>
+            <w:tcW w:type="dxa" w:w="1656"/>
+            <w:vAlign w:val="center"/>
+            <w:shd w:fill="F2F2F2" w:val="clear"/>
+            <w:tcBorders>
+              <w:top w:val="single" w:sz="3" w:space="0" w:color="999999"/>
+              <w:left w:val="single" w:sz="3" w:space="0" w:color="999999"/>
+              <w:bottom w:val="single" w:sz="3" w:space="0" w:color="999999"/>
+              <w:right w:val="single" w:sz="3" w:space="0" w:color="999999"/>
+            </w:tcBorders>
+          </w:tcPr>
+          <w:p>
+            <w:pPr>
+              <w:spacing w:after="20" w:before="20"/>
+              <w:jc w:val="center"/>
+            </w:pPr>
+            <w:r>
+              <w:rPr>
+                <w:rFonts w:ascii="Times New Roman" w:hAnsi="Times New Roman" w:eastAsia="宋体"/>
+                <w:sz w:val="14"/>
+              </w:rPr>
+              <w:t>26.556</w:t>
+            </w:r>
+          </w:p>
+        </w:tc>
+        <w:tc>
+          <w:tcPr>
+            <w:tcW w:type="dxa" w:w="2736"/>
             <w:vAlign w:val="center"/>
             <w:shd w:fill="F2F2F2" w:val="clear"/>
             <w:tcBorders>
@@ -3450,7 +3386,189 @@
         </w:tc>
         <w:tc>
           <w:tcPr>
-            <w:tcW w:type="dxa" w:w="1872"/>
+            <w:tcW w:type="dxa" w:w="2304"/>
+            <w:vAlign w:val="center"/>
+            <w:shd w:fill="F2F2F2" w:val="clear"/>
+            <w:tcBorders>
+              <w:top w:val="single" w:sz="3" w:space="0" w:color="999999"/>
+              <w:left w:val="single" w:sz="3" w:space="0" w:color="999999"/>
+              <w:bottom w:val="single" w:sz="3" w:space="0" w:color="999999"/>
+              <w:right w:val="single" w:sz="3" w:space="0" w:color="999999"/>
+            </w:tcBorders>
+          </w:tcPr>
+          <w:p>
+            <w:pPr>
+              <w:spacing w:after="20" w:before="20"/>
+              <w:jc w:val="center"/>
+            </w:pPr>
+            <w:r>
+              <w:rPr>
+                <w:rFonts w:ascii="Times New Roman" w:hAnsi="Times New Roman" w:eastAsia="宋体"/>
+                <w:sz w:val="14"/>
+              </w:rPr>
+              <w:t>—</w:t>
+            </w:r>
+          </w:p>
+        </w:tc>
+      </w:tr>
+      <w:tr>
+        <w:tc>
+          <w:tcPr>
+            <w:tcW w:type="dxa" w:w="720"/>
+            <w:vAlign w:val="center"/>
+            <w:tcBorders>
+              <w:top w:val="single" w:sz="3" w:space="0" w:color="999999"/>
+              <w:left w:val="single" w:sz="3" w:space="0" w:color="999999"/>
+              <w:bottom w:val="single" w:sz="3" w:space="0" w:color="999999"/>
+              <w:right w:val="single" w:sz="3" w:space="0" w:color="999999"/>
+            </w:tcBorders>
+          </w:tcPr>
+          <w:p>
+            <w:pPr>
+              <w:spacing w:after="20" w:before="20"/>
+              <w:jc w:val="center"/>
+            </w:pPr>
+            <w:r>
+              <w:rPr>
+                <w:rFonts w:ascii="Times New Roman" w:hAnsi="Times New Roman" w:eastAsia="宋体"/>
+                <w:sz w:val="14"/>
+              </w:rPr>
+              <w:t>60</w:t>
+            </w:r>
+          </w:p>
+        </w:tc>
+        <w:tc>
+          <w:tcPr>
+            <w:tcW w:type="dxa" w:w="1656"/>
+            <w:vAlign w:val="center"/>
+            <w:tcBorders>
+              <w:top w:val="single" w:sz="3" w:space="0" w:color="999999"/>
+              <w:left w:val="single" w:sz="3" w:space="0" w:color="999999"/>
+              <w:bottom w:val="single" w:sz="3" w:space="0" w:color="999999"/>
+              <w:right w:val="single" w:sz="3" w:space="0" w:color="999999"/>
+            </w:tcBorders>
+          </w:tcPr>
+          <w:p>
+            <w:pPr>
+              <w:spacing w:after="20" w:before="20"/>
+              <w:jc w:val="center"/>
+            </w:pPr>
+            <w:r>
+              <w:rPr>
+                <w:rFonts w:ascii="Times New Roman" w:hAnsi="Times New Roman" w:eastAsia="宋体"/>
+                <w:sz w:val="14"/>
+              </w:rPr>
+              <w:t>22.855</w:t>
+            </w:r>
+          </w:p>
+        </w:tc>
+        <w:tc>
+          <w:tcPr>
+            <w:tcW w:type="dxa" w:w="2736"/>
+            <w:vAlign w:val="center"/>
+            <w:tcBorders>
+              <w:top w:val="single" w:sz="3" w:space="0" w:color="999999"/>
+              <w:left w:val="single" w:sz="3" w:space="0" w:color="999999"/>
+              <w:bottom w:val="single" w:sz="3" w:space="0" w:color="999999"/>
+              <w:right w:val="single" w:sz="3" w:space="0" w:color="999999"/>
+            </w:tcBorders>
+          </w:tcPr>
+          <w:p>
+            <w:pPr>
+              <w:spacing w:after="20" w:before="20"/>
+              <w:jc w:val="center"/>
+            </w:pPr>
+            <w:r>
+              <w:rPr>
+                <w:rFonts w:ascii="Times New Roman" w:hAnsi="Times New Roman" w:eastAsia="宋体"/>
+                <w:sz w:val="14"/>
+              </w:rPr>
+              <w:t>—</w:t>
+            </w:r>
+          </w:p>
+        </w:tc>
+        <w:tc>
+          <w:tcPr>
+            <w:tcW w:type="dxa" w:w="2304"/>
+            <w:vAlign w:val="center"/>
+            <w:tcBorders>
+              <w:top w:val="single" w:sz="3" w:space="0" w:color="999999"/>
+              <w:left w:val="single" w:sz="3" w:space="0" w:color="999999"/>
+              <w:bottom w:val="single" w:sz="3" w:space="0" w:color="999999"/>
+              <w:right w:val="single" w:sz="3" w:space="0" w:color="999999"/>
+            </w:tcBorders>
+          </w:tcPr>
+          <w:p>
+            <w:pPr>
+              <w:spacing w:after="20" w:before="20"/>
+              <w:jc w:val="center"/>
+            </w:pPr>
+            <w:r>
+              <w:rPr>
+                <w:rFonts w:ascii="Times New Roman" w:hAnsi="Times New Roman" w:eastAsia="宋体"/>
+                <w:sz w:val="14"/>
+              </w:rPr>
+              <w:t>—</w:t>
+            </w:r>
+          </w:p>
+        </w:tc>
+      </w:tr>
+      <w:tr>
+        <w:tc>
+          <w:tcPr>
+            <w:tcW w:type="dxa" w:w="720"/>
+            <w:vAlign w:val="center"/>
+            <w:shd w:fill="F2F2F2" w:val="clear"/>
+            <w:tcBorders>
+              <w:top w:val="single" w:sz="3" w:space="0" w:color="999999"/>
+              <w:left w:val="single" w:sz="3" w:space="0" w:color="999999"/>
+              <w:bottom w:val="single" w:sz="3" w:space="0" w:color="999999"/>
+              <w:right w:val="single" w:sz="3" w:space="0" w:color="999999"/>
+            </w:tcBorders>
+          </w:tcPr>
+          <w:p>
+            <w:pPr>
+              <w:spacing w:after="20" w:before="20"/>
+              <w:jc w:val="center"/>
+            </w:pPr>
+            <w:r>
+              <w:rPr>
+                <w:rFonts w:ascii="Times New Roman" w:hAnsi="Times New Roman" w:eastAsia="宋体"/>
+                <w:sz w:val="14"/>
+              </w:rPr>
+              <w:t>70</w:t>
+            </w:r>
+          </w:p>
+        </w:tc>
+        <w:tc>
+          <w:tcPr>
+            <w:tcW w:type="dxa" w:w="1656"/>
+            <w:vAlign w:val="center"/>
+            <w:shd w:fill="F2F2F2" w:val="clear"/>
+            <w:tcBorders>
+              <w:top w:val="single" w:sz="3" w:space="0" w:color="999999"/>
+              <w:left w:val="single" w:sz="3" w:space="0" w:color="999999"/>
+              <w:bottom w:val="single" w:sz="3" w:space="0" w:color="999999"/>
+              <w:right w:val="single" w:sz="3" w:space="0" w:color="999999"/>
+            </w:tcBorders>
+          </w:tcPr>
+          <w:p>
+            <w:pPr>
+              <w:spacing w:after="20" w:before="20"/>
+              <w:jc w:val="center"/>
+            </w:pPr>
+            <w:r>
+              <w:rPr>
+                <w:rFonts w:ascii="Times New Roman" w:hAnsi="Times New Roman" w:eastAsia="宋体"/>
+                <w:sz w:val="14"/>
+              </w:rPr>
+              <w:t>19.370</w:t>
+            </w:r>
+          </w:p>
+        </w:tc>
+        <w:tc>
+          <w:tcPr>
+            <w:tcW w:type="dxa" w:w="2736"/>
             <w:vAlign w:val="center"/>
             <w:shd w:fill="F2F2F2" w:val="clear"/>
             <w:tcBorders>
@@ -3476,32 +3594,6 @@
         </w:tc>
         <w:tc>
           <w:tcPr>
-            <w:tcW w:type="dxa" w:w="3168"/>
-            <w:vAlign w:val="center"/>
-            <w:shd w:fill="F2F2F2" w:val="clear"/>
-            <w:tcBorders>
-              <w:top w:val="single" w:sz="3" w:space="0" w:color="999999"/>
-              <w:left w:val="single" w:sz="3" w:space="0" w:color="999999"/>
-              <w:bottom w:val="single" w:sz="3" w:space="0" w:color="999999"/>
-              <w:right w:val="single" w:sz="3" w:space="0" w:color="999999"/>
-            </w:tcBorders>
-          </w:tcPr>
-          <w:p>
-            <w:pPr>
-              <w:spacing w:after="20" w:before="20"/>
-              <w:jc w:val="center"/>
-            </w:pPr>
-            <w:r>
-              <w:rPr>
-                <w:rFonts w:ascii="Times New Roman" w:hAnsi="Times New Roman" w:eastAsia="宋体"/>
-                <w:sz w:val="14"/>
-              </w:rPr>
-              <w:t>s̄= l̄/40 =0.1503 mm</w:t>
-            </w:r>
-          </w:p>
-        </w:tc>
-        <w:tc>
-          <w:tcPr>
             <w:tcW w:type="dxa" w:w="2304"/>
             <w:vAlign w:val="center"/>
             <w:shd w:fill="F2F2F2" w:val="clear"/>
@@ -3522,7 +3614,109 @@
                 <w:rFonts w:ascii="Times New Roman" w:hAnsi="Times New Roman" w:eastAsia="宋体"/>
                 <w:sz w:val="14"/>
               </w:rPr>
-              <w:t>相邻间距</w:t>
+              <w:t>—</w:t>
+            </w:r>
+          </w:p>
+        </w:tc>
+      </w:tr>
+      <w:tr>
+        <w:tc>
+          <w:tcPr>
+            <w:tcW w:type="dxa" w:w="720"/>
+            <w:vAlign w:val="center"/>
+            <w:tcBorders>
+              <w:top w:val="single" w:sz="3" w:space="0" w:color="999999"/>
+              <w:left w:val="single" w:sz="3" w:space="0" w:color="999999"/>
+              <w:bottom w:val="single" w:sz="3" w:space="0" w:color="999999"/>
+              <w:right w:val="single" w:sz="3" w:space="0" w:color="999999"/>
+            </w:tcBorders>
+          </w:tcPr>
+          <w:p>
+            <w:pPr>
+              <w:spacing w:after="20" w:before="20"/>
+              <w:jc w:val="center"/>
+            </w:pPr>
+            <w:r>
+              <w:rPr>
+                <w:rFonts w:ascii="Times New Roman" w:hAnsi="Times New Roman" w:eastAsia="宋体"/>
+                <w:sz w:val="14"/>
+              </w:rPr>
+              <w:t>80</w:t>
+            </w:r>
+          </w:p>
+        </w:tc>
+        <w:tc>
+          <w:tcPr>
+            <w:tcW w:type="dxa" w:w="1656"/>
+            <w:vAlign w:val="center"/>
+            <w:tcBorders>
+              <w:top w:val="single" w:sz="3" w:space="0" w:color="999999"/>
+              <w:left w:val="single" w:sz="3" w:space="0" w:color="999999"/>
+              <w:bottom w:val="single" w:sz="3" w:space="0" w:color="999999"/>
+              <w:right w:val="single" w:sz="3" w:space="0" w:color="999999"/>
+            </w:tcBorders>
+          </w:tcPr>
+          <w:p>
+            <w:pPr>
+              <w:spacing w:after="20" w:before="20"/>
+              <w:jc w:val="center"/>
+            </w:pPr>
+            <w:r>
+              <w:rPr>
+                <w:rFonts w:ascii="Times New Roman" w:hAnsi="Times New Roman" w:eastAsia="宋体"/>
+                <w:sz w:val="14"/>
+              </w:rPr>
+              <w:t>—</w:t>
+            </w:r>
+          </w:p>
+        </w:tc>
+        <w:tc>
+          <w:tcPr>
+            <w:tcW w:type="dxa" w:w="2736"/>
+            <w:vAlign w:val="center"/>
+            <w:tcBorders>
+              <w:top w:val="single" w:sz="3" w:space="0" w:color="999999"/>
+              <w:left w:val="single" w:sz="3" w:space="0" w:color="999999"/>
+              <w:bottom w:val="single" w:sz="3" w:space="0" w:color="999999"/>
+              <w:right w:val="single" w:sz="3" w:space="0" w:color="999999"/>
+            </w:tcBorders>
+          </w:tcPr>
+          <w:p>
+            <w:pPr>
+              <w:spacing w:after="20" w:before="20"/>
+              <w:jc w:val="center"/>
+            </w:pPr>
+            <w:r>
+              <w:rPr>
+                <w:rFonts w:ascii="Times New Roman" w:hAnsi="Times New Roman" w:eastAsia="宋体"/>
+                <w:sz w:val="14"/>
+              </w:rPr>
+              <w:t>—</w:t>
+            </w:r>
+          </w:p>
+        </w:tc>
+        <w:tc>
+          <w:tcPr>
+            <w:tcW w:type="dxa" w:w="2304"/>
+            <w:vAlign w:val="center"/>
+            <w:tcBorders>
+              <w:top w:val="single" w:sz="3" w:space="0" w:color="999999"/>
+              <w:left w:val="single" w:sz="3" w:space="0" w:color="999999"/>
+              <w:bottom w:val="single" w:sz="3" w:space="0" w:color="999999"/>
+              <w:right w:val="single" w:sz="3" w:space="0" w:color="999999"/>
+            </w:tcBorders>
+          </w:tcPr>
+          <w:p>
+            <w:pPr>
+              <w:spacing w:after="20" w:before="20"/>
+              <w:jc w:val="center"/>
+            </w:pPr>
+            <w:r>
+              <w:rPr>
+                <w:rFonts w:ascii="Times New Roman" w:hAnsi="Times New Roman" w:eastAsia="宋体"/>
+                <w:sz w:val="14"/>
+              </w:rPr>
+              <w:t>—</w:t>
             </w:r>
           </w:p>
         </w:tc>
@@ -3531,15 +3725,33 @@
     <w:p>
       <w:pPr>
         <w:widowControl/>
-        <w:spacing w:after="40" w:before="0" w:line="240" w:lineRule="auto"/>
+        <w:spacing w:after="80" w:before="0" w:line="240" w:lineRule="auto"/>
       </w:pPr>
       <w:r>
         <w:rPr>
           <w:rFonts w:ascii="Times New Roman" w:hAnsi="Times New Roman" w:eastAsia="宋体"/>
           <w:b w:val="0"/>
+          <w:i/>
+          <w:color w:val="595959"/>
+          <w:sz w:val="14"/>
+        </w:rPr>
+        <w:t>s̄ = l̄/40 =17.022/40=0.4256 mm；四 l 呈递减 19.0→15.2 mm，反映楔角非完全均匀（下同误差分析）。</w:t>
+      </w:r>
+    </w:p>
+    <w:p>
+      <w:pPr>
+        <w:widowControl/>
+        <w:spacing w:after="40" w:before="0" w:line="240" w:lineRule="auto"/>
+        <w:jc w:val="center"/>
+      </w:pPr>
+      <w:r>
+        <w:rPr>
+          <w:rFonts w:ascii="Times New Roman" w:hAnsi="Times New Roman" w:eastAsia="宋体"/>
+          <w:b/>
           <w:i w:val="0"/>
-          <w:sz w:val="4"/>
+          <w:sz w:val="16"/>
         </w:rPr>
+        <w:t>下段：劈尖长度 L</w:t>
       </w:r>
     </w:p>
     <w:tbl>
@@ -3579,13 +3791,13 @@
                 <w:color w:val="FFFFFF"/>
                 <w:sz w:val="14"/>
               </w:rPr>
-              <w:t>r</w:t>
+              <w:t>组别 i</w:t>
             </w:r>
           </w:p>
         </w:tc>
         <w:tc>
           <w:tcPr>
-            <w:tcW w:type="dxa" w:w="2160"/>
+            <w:tcW w:type="dxa" w:w="2016"/>
             <w:vAlign w:val="center"/>
             <w:shd w:fill="548235" w:val="clear"/>
             <w:tcBorders>
@@ -3606,13 +3818,13 @@
                 <w:color w:val="FFFFFF"/>
                 <w:sz w:val="14"/>
               </w:rPr>
-              <w:t>n_0r /mm</w:t>
+              <w:t>n_0i /mm</w:t>
             </w:r>
           </w:p>
         </w:tc>
         <w:tc>
           <w:tcPr>
-            <w:tcW w:type="dxa" w:w="2160"/>
+            <w:tcW w:type="dxa" w:w="2016"/>
             <w:vAlign w:val="center"/>
             <w:shd w:fill="548235" w:val="clear"/>
             <w:tcBorders>
@@ -3633,13 +3845,13 @@
                 <w:color w:val="FFFFFF"/>
                 <w:sz w:val="14"/>
               </w:rPr>
-              <w:t>n_r /mm</w:t>
+              <w:t>n_i /mm</w:t>
             </w:r>
           </w:p>
         </w:tc>
         <w:tc>
           <w:tcPr>
-            <w:tcW w:type="dxa" w:w="2736"/>
+            <w:tcW w:type="dxa" w:w="2448"/>
             <w:vAlign w:val="center"/>
             <w:shd w:fill="548235" w:val="clear"/>
             <w:tcBorders>
@@ -3660,7 +3872,7 @@
                 <w:color w:val="FFFFFF"/>
                 <w:sz w:val="14"/>
               </w:rPr>
-              <w:t>L_r=|n_r−n_0r| /mm</w:t>
+              <w:t>L_i=|n_i−n_0i| /mm</w:t>
             </w:r>
           </w:p>
         </w:tc>
@@ -3693,7 +3905,7 @@
         </w:tc>
         <w:tc>
           <w:tcPr>
-            <w:tcW w:type="dxa" w:w="2160"/>
+            <w:tcW w:type="dxa" w:w="2016"/>
             <w:vAlign w:val="center"/>
             <w:tcBorders>
               <w:top w:val="single" w:sz="3" w:space="0" w:color="999999"/>
@@ -3712,13 +3924,13 @@
                 <w:rFonts w:ascii="Times New Roman" w:hAnsi="Times New Roman" w:eastAsia="宋体"/>
                 <w:sz w:val="14"/>
               </w:rPr>
-              <w:t>5.012</w:t>
+              <w:t>0.000</w:t>
             </w:r>
           </w:p>
         </w:tc>
         <w:tc>
           <w:tcPr>
-            <w:tcW w:type="dxa" w:w="2160"/>
+            <w:tcW w:type="dxa" w:w="2016"/>
             <w:vAlign w:val="center"/>
             <w:tcBorders>
               <w:top w:val="single" w:sz="3" w:space="0" w:color="999999"/>
@@ -3737,13 +3949,13 @@
                 <w:rFonts w:ascii="Times New Roman" w:hAnsi="Times New Roman" w:eastAsia="宋体"/>
                 <w:sz w:val="14"/>
               </w:rPr>
-              <w:t>50.18</w:t>
+              <w:t>33.452</w:t>
             </w:r>
           </w:p>
         </w:tc>
         <w:tc>
           <w:tcPr>
-            <w:tcW w:type="dxa" w:w="2736"/>
+            <w:tcW w:type="dxa" w:w="2448"/>
             <w:vAlign w:val="center"/>
             <w:tcBorders>
               <w:top w:val="single" w:sz="3" w:space="0" w:color="999999"/>
@@ -3762,7 +3974,7 @@
                 <w:rFonts w:ascii="Times New Roman" w:hAnsi="Times New Roman" w:eastAsia="宋体"/>
                 <w:sz w:val="14"/>
               </w:rPr>
-              <w:t>45.17</w:t>
+              <w:t>33.450</w:t>
             </w:r>
           </w:p>
         </w:tc>
@@ -3796,7 +4008,7 @@
         </w:tc>
         <w:tc>
           <w:tcPr>
-            <w:tcW w:type="dxa" w:w="2160"/>
+            <w:tcW w:type="dxa" w:w="2016"/>
             <w:vAlign w:val="center"/>
             <w:shd w:fill="F2F2F2" w:val="clear"/>
             <w:tcBorders>
@@ -3816,13 +4028,13 @@
                 <w:rFonts w:ascii="Times New Roman" w:hAnsi="Times New Roman" w:eastAsia="宋体"/>
                 <w:sz w:val="14"/>
               </w:rPr>
-              <w:t>5.020</w:t>
+              <w:t>-0.065</w:t>
             </w:r>
           </w:p>
         </w:tc>
         <w:tc>
           <w:tcPr>
-            <w:tcW w:type="dxa" w:w="2160"/>
+            <w:tcW w:type="dxa" w:w="2016"/>
             <w:vAlign w:val="center"/>
             <w:shd w:fill="F2F2F2" w:val="clear"/>
             <w:tcBorders>
@@ -3842,13 +4054,13 @@
                 <w:rFonts w:ascii="Times New Roman" w:hAnsi="Times New Roman" w:eastAsia="宋体"/>
                 <w:sz w:val="14"/>
               </w:rPr>
-              <w:t>50.22</w:t>
+              <w:t>33.455</w:t>
             </w:r>
           </w:p>
         </w:tc>
         <w:tc>
           <w:tcPr>
-            <w:tcW w:type="dxa" w:w="2736"/>
+            <w:tcW w:type="dxa" w:w="2448"/>
             <w:vAlign w:val="center"/>
             <w:shd w:fill="F2F2F2" w:val="clear"/>
             <w:tcBorders>
@@ -3868,7 +4080,7 @@
                 <w:rFonts w:ascii="Times New Roman" w:hAnsi="Times New Roman" w:eastAsia="宋体"/>
                 <w:sz w:val="14"/>
               </w:rPr>
-              <w:t>45.20</w:t>
+              <w:t>33.520</w:t>
             </w:r>
           </w:p>
         </w:tc>
@@ -3901,7 +4113,7 @@
         </w:tc>
         <w:tc>
           <w:tcPr>
-            <w:tcW w:type="dxa" w:w="2160"/>
+            <w:tcW w:type="dxa" w:w="2016"/>
             <w:vAlign w:val="center"/>
             <w:tcBorders>
               <w:top w:val="single" w:sz="3" w:space="0" w:color="999999"/>
@@ -3920,13 +4132,13 @@
                 <w:rFonts w:ascii="Times New Roman" w:hAnsi="Times New Roman" w:eastAsia="宋体"/>
                 <w:sz w:val="14"/>
               </w:rPr>
-              <w:t>5.015</w:t>
+              <w:t>0.000</w:t>
             </w:r>
           </w:p>
         </w:tc>
         <w:tc>
           <w:tcPr>
-            <w:tcW w:type="dxa" w:w="2160"/>
+            <w:tcW w:type="dxa" w:w="2016"/>
             <w:vAlign w:val="center"/>
             <w:tcBorders>
               <w:top w:val="single" w:sz="3" w:space="0" w:color="999999"/>
@@ -3945,13 +4157,13 @@
                 <w:rFonts w:ascii="Times New Roman" w:hAnsi="Times New Roman" w:eastAsia="宋体"/>
                 <w:sz w:val="14"/>
               </w:rPr>
-              <w:t>50.23</w:t>
+              <w:t>33.585</w:t>
             </w:r>
           </w:p>
         </w:tc>
         <w:tc>
           <w:tcPr>
-            <w:tcW w:type="dxa" w:w="2736"/>
+            <w:tcW w:type="dxa" w:w="2448"/>
             <w:vAlign w:val="center"/>
             <w:tcBorders>
               <w:top w:val="single" w:sz="3" w:space="0" w:color="999999"/>
@@ -3970,7 +4182,7 @@
                 <w:rFonts w:ascii="Times New Roman" w:hAnsi="Times New Roman" w:eastAsia="宋体"/>
                 <w:sz w:val="14"/>
               </w:rPr>
-              <w:t>45.22</w:t>
+              <w:t>33.585</w:t>
             </w:r>
           </w:p>
         </w:tc>
@@ -4004,7 +4216,7 @@
         </w:tc>
         <w:tc>
           <w:tcPr>
-            <w:tcW w:type="dxa" w:w="2160"/>
+            <w:tcW w:type="dxa" w:w="2016"/>
             <w:vAlign w:val="center"/>
             <w:shd w:fill="F2F2F2" w:val="clear"/>
             <w:tcBorders>
@@ -4030,7 +4242,7 @@
         </w:tc>
         <w:tc>
           <w:tcPr>
-            <w:tcW w:type="dxa" w:w="2160"/>
+            <w:tcW w:type="dxa" w:w="2016"/>
             <w:vAlign w:val="center"/>
             <w:shd w:fill="F2F2F2" w:val="clear"/>
             <w:tcBorders>
@@ -4056,7 +4268,7 @@
         </w:tc>
         <w:tc>
           <w:tcPr>
-            <w:tcW w:type="dxa" w:w="2736"/>
+            <w:tcW w:type="dxa" w:w="2448"/>
             <w:vAlign w:val="center"/>
             <w:shd w:fill="F2F2F2" w:val="clear"/>
             <w:tcBorders>
@@ -4076,7 +4288,7 @@
                 <w:rFonts w:ascii="Times New Roman" w:hAnsi="Times New Roman" w:eastAsia="宋体"/>
                 <w:sz w:val="14"/>
               </w:rPr>
-              <w:t>L̄=45.20 mm</w:t>
+              <w:t>L̄=33.519 mm</w:t>
             </w:r>
           </w:p>
         </w:tc>
@@ -4095,7 +4307,7 @@
           <w:color w:val="595959"/>
           <w:sz w:val="14"/>
         </w:rPr>
-        <w:t>注：上半 n_0–n_40 为每隔 10 条读一次（0→80 全程），l_10=|n_40−n_0|=6.015（40 条间距）以此类推 4 个 l 再平均；下半 L_r 为劈尖两端读数差，三次平均。原表右侧 s̄ 与 L̄ 各为跨 5/3 行大格，誊抄拆行但数值一致。</w:t>
+        <w:t>L_1=33.452−0.000=33.452≈33.450（手写舍入差0.002 mm），L_2=33.455−(−0.065)=33.520，L_3=33.585；L̄=100.555/3=33.519 mm。</w:t>
       </w:r>
     </w:p>
     <w:p>
@@ -4150,7 +4362,7 @@
           <w:color w:val="333333"/>
           <w:sz w:val="15"/>
         </w:rPr>
-        <w:t>附：课本 p230 原表 1 印刷截图（右侧 ū 为 5 行大格，核对手绘用）</w:t>
+        <w:t>附：课本 p230 原表1印刷截图（右侧 ū 为5行大格）</w:t>
       </w:r>
     </w:p>
     <w:p>
@@ -4205,55 +4417,12 @@
           <w:color w:val="333333"/>
           <w:sz w:val="15"/>
         </w:rPr>
-        <w:t>附：课本 p231 原表 2 印刷截图（上半 s̄、下半 L̄ 为大格）</w:t>
+        <w:t>附：课本 p231 原表2印刷截图（上半 s̄、下半 L̄ 为大格）</w:t>
       </w:r>
     </w:p>
     <w:p>
       <w:pPr>
-        <w:shd w:fill="DEEAF6" w:val="clear"/>
-        <w:pBdr>
-          <w:left w:val="single" w:sz="12" w:space="4" w:color="2E75B6"/>
-        </w:pBdr>
-        <w:spacing w:before="160" w:after="80"/>
-      </w:pPr>
-      <w:r>
-        <w:rPr>
-          <w:rFonts w:ascii="Times New Roman" w:hAnsi="宋体" w:eastAsia="宋体"/>
-          <w:b/>
-          <w:color w:val="1F4E78"/>
-          <w:sz w:val="22"/>
-        </w:rPr>
-        <w:t xml:space="preserve">  六、  数据处理与误差分析</w:t>
-      </w:r>
-      <w:r>
-        <w:rPr>
-          <w:rFonts w:ascii="Times New Roman" w:hAnsi="Times New Roman"/>
-          <w:i/>
-          <w:color w:val="5A5A5A"/>
-          <w:sz w:val="14"/>
-        </w:rPr>
-        <w:t xml:space="preserve">  Data Reduction &amp; Uncertainty</w:t>
-      </w:r>
-    </w:p>
-    <w:p>
-      <w:pPr>
-        <w:widowControl/>
-        <w:spacing w:after="80" w:before="0" w:line="240" w:lineRule="auto"/>
-      </w:pPr>
-      <w:r>
-        <w:rPr>
-          <w:rFonts w:ascii="Times New Roman" w:hAnsi="Times New Roman" w:eastAsia="宋体"/>
-          <w:b w:val="0"/>
-          <w:i/>
-          <w:color w:val="595959"/>
-          <w:sz w:val="15"/>
-        </w:rPr>
-        <w:t>以下按课本要求不计 λ 误差，用标准偏差合成（A 类），k=1。</w:t>
-      </w:r>
-    </w:p>
-    <w:p>
-      <w:pPr>
-        <w:spacing w:after="40" w:before="40"/>
+        <w:spacing w:after="40" w:before="80"/>
       </w:pPr>
       <w:r>
         <w:rPr>
@@ -4262,7 +4431,22 @@
           <w:color w:val="1F4E78"/>
           <w:sz w:val="20"/>
         </w:rPr>
-        <w:t>1.  牛顿环求 R（逐差法，m=5）</w:t>
+        <w:t>数据处理与不确定度（k=1，不计 λ 误差）</w:t>
+      </w:r>
+    </w:p>
+    <w:p>
+      <w:pPr>
+        <w:widowControl/>
+        <w:spacing w:after="20" w:before="40" w:line="240" w:lineRule="auto"/>
+      </w:pPr>
+      <w:r>
+        <w:rPr>
+          <w:rFonts w:ascii="Times New Roman" w:hAnsi="Times New Roman" w:eastAsia="宋体"/>
+          <w:b/>
+          <w:i w:val="0"/>
+          <w:sz w:val="18"/>
+        </w:rPr>
+        <w:t>（1）牛顿环求 R（逐差，m=5）</w:t>
       </w:r>
     </w:p>
     <w:p>
@@ -4278,7 +4462,7 @@
           <w:i w:val="0"/>
           <w:sz w:val="18"/>
         </w:rPr>
-        <w:t>平均值  ū = (14.18+14.12+14.15+14.09+14.16)/5 = 14.14 mm²。</w:t>
+        <w:t>平均值 ū=11.958 mm²。5个u的实验标准偏差 s(u_k)= sqrt[ Σ(u_k−ū)²/(5−1) ]：u−ū为 −0.054、−0.003、+0.282、−0.128、−0.096，平方和0.1080 → s(u_k)= sqrt(0.1080/4)=0.164 mm²，则 s_ū = s(u_k)/√5 =0.164/2.236=0.0735 mm²。</w:t>
       </w:r>
     </w:p>
     <w:p>
@@ -4294,39 +4478,7 @@
           <w:i w:val="0"/>
           <w:sz w:val="18"/>
         </w:rPr>
-        <w:t>5 个 u_k 的实验标准偏差  s(u_k) = sqrt[ Σ(u_k−ū)²/(5−1) ] = 0.036 mm²，则平均值标准偏差  s_ū = s(u_k)/√5 = 0.016 mm²。</w:t>
-      </w:r>
-    </w:p>
-    <w:p>
-      <w:pPr>
-        <w:widowControl/>
-        <w:spacing w:after="20" w:before="0" w:line="240" w:lineRule="auto"/>
-        <w:ind w:firstLine="360"/>
-      </w:pPr>
-      <w:r>
-        <w:rPr>
-          <w:rFonts w:ascii="Times New Roman" w:hAnsi="Times New Roman" w:eastAsia="宋体"/>
-          <w:b w:val="0"/>
-          <w:i w:val="0"/>
-          <w:sz w:val="18"/>
-        </w:rPr>
-        <w:t>曲率半径  R̄ = ū/(4·m·λ) = ū/(20·λ)。λ=589.3 nm=0.0005893 mm，20·λ=0.011786 mm，故  R̄ =14.14/0.011786 =1200 mm =1.20 m。</w:t>
-      </w:r>
-    </w:p>
-    <w:p>
-      <w:pPr>
-        <w:widowControl/>
-        <w:spacing w:after="20" w:before="0" w:line="240" w:lineRule="auto"/>
-        <w:ind w:firstLine="360"/>
-      </w:pPr>
-      <w:r>
-        <w:rPr>
-          <w:rFonts w:ascii="Times New Roman" w:hAnsi="Times New Roman" w:eastAsia="宋体"/>
-          <w:b w:val="0"/>
-          <w:i w:val="0"/>
-          <w:sz w:val="18"/>
-        </w:rPr>
-        <w:t>s_R = s_ū/(20·λ)=0.016/0.011786=1.36 mm，不计 λ 误差，则相对不确定度  E_R = s_R/R̄ =1.36/1200=0.11%。</w:t>
+        <w:t>R̄ = ū/(20·λ)，20·λ=0.011786 mm → R̄=11.958/0.011786=1014.6 mm=1.015 m。s_R= s_ū/(20·λ)=0.0735/0.011786=6.24 mm，E_R= s_R/R̄=6.24/1014.6=0.62%。</w:t>
       </w:r>
     </w:p>
     <w:p>
@@ -4348,38 +4500,22 @@
           <w:color w:val="7F6003"/>
           <w:sz w:val="19"/>
         </w:rPr>
-        <w:t>结果：  R = (1.200 ±0.002) m　　(E_R = 0.11%，k=1)</w:t>
+        <w:t>结果：  R = (1.015 ±0.006) m = (1015 ±6) mm　　(E_R = 0.62%，k=1)</w:t>
       </w:r>
     </w:p>
     <w:p>
       <w:pPr>
         <w:widowControl/>
-        <w:spacing w:after="120" w:before="0" w:line="240" w:lineRule="auto"/>
-        <w:ind w:firstLine="360"/>
+        <w:spacing w:after="20" w:before="80" w:line="240" w:lineRule="auto"/>
       </w:pPr>
       <w:r>
         <w:rPr>
           <w:rFonts w:ascii="Times New Roman" w:hAnsi="Times New Roman" w:eastAsia="宋体"/>
-          <w:b w:val="0"/>
-          <w:i/>
-          <w:color w:val="595959"/>
-          <w:sz w:val="15"/>
+          <w:b/>
+          <w:i w:val="0"/>
+          <w:sz w:val="18"/>
         </w:rPr>
-        <w:t>与标称约 1.0–1.3 m 符合。若作 d_k²−k 图，斜率亦为 R·λ，本例逐差法已消中心附加误差，无需另作图。</w:t>
-      </w:r>
-    </w:p>
-    <w:p>
-      <w:pPr>
-        <w:spacing w:after="40" w:before="80"/>
-      </w:pPr>
-      <w:r>
-        <w:rPr>
-          <w:rFonts w:ascii="宋体" w:hAnsi="宋体" w:eastAsia="宋体"/>
-          <w:b/>
-          <w:color w:val="1F4E78"/>
-          <w:sz w:val="20"/>
-        </w:rPr>
-        <w:t>2.  劈尖求 D（两式对比，不确定度按式 2.22.6）</w:t>
+        <w:t>（2）劈尖求 D（两式对照，以 2.22.6 为准）</w:t>
       </w:r>
     </w:p>
     <w:p>
@@ -4395,7 +4531,23 @@
           <w:i w:val="0"/>
           <w:sz w:val="18"/>
         </w:rPr>
-        <w:t>(5) 式估算：D_N = N·λ/2 =92×0.0005893/2 =0.0271 mm（不计误差，仅作对照；因末条未到边缘而偏小）。</w:t>
+        <w:t>(2.22.5)式：D_N = N·λ/2 =70×0.0005893/2=0.0206 mm=20.6 μm（仅计数，不计误差，作对照）。</w:t>
+      </w:r>
+    </w:p>
+    <w:p>
+      <w:pPr>
+        <w:widowControl/>
+        <w:spacing w:after="20" w:before="0" w:line="240" w:lineRule="auto"/>
+        <w:ind w:firstLine="360"/>
+      </w:pPr>
+      <w:r>
+        <w:rPr>
+          <w:rFonts w:ascii="Times New Roman" w:hAnsi="Times New Roman" w:eastAsia="宋体"/>
+          <w:b/>
+          <w:i w:val="0"/>
+          <w:sz w:val="18"/>
+        </w:rPr>
+        <w:t>(2.22.6)式：s̄=0.4256 mm，L̄=33.519 mm → D = (L̄/s̄)·λ/2 = (33.519/0.4256)×0.0005893/2 =0.0232 mm=23.2 μm。</w:t>
       </w:r>
     </w:p>
     <w:p>
@@ -4411,39 +4563,7 @@
           <w:i w:val="0"/>
           <w:sz w:val="18"/>
         </w:rPr>
-        <w:t>(6) 式为准：s̄ = l̄/40 =6.012/40=0.1503 mm，L̄=45.20 mm。</w:t>
-      </w:r>
-    </w:p>
-    <w:p>
-      <w:pPr>
-        <w:widowControl/>
-        <w:spacing w:after="40" w:before="0" w:line="240" w:lineRule="auto"/>
-        <w:ind w:firstLine="360"/>
-      </w:pPr>
-      <w:r>
-        <w:rPr>
-          <w:rFonts w:ascii="Times New Roman" w:hAnsi="Times New Roman" w:eastAsia="宋体"/>
-          <w:b/>
-          <w:i w:val="0"/>
-          <w:sz w:val="18"/>
-        </w:rPr>
-        <w:t>D = (L̄/s̄)·λ/2 = (45.20/0.1503)×0.0005893/2 =0.0886 mm。</w:t>
-      </w:r>
-    </w:p>
-    <w:p>
-      <w:pPr>
-        <w:widowControl/>
-        <w:spacing w:after="20" w:before="0" w:line="240" w:lineRule="auto"/>
-        <w:ind w:firstLine="360"/>
-      </w:pPr>
-      <w:r>
-        <w:rPr>
-          <w:rFonts w:ascii="Times New Roman" w:hAnsi="Times New Roman" w:eastAsia="宋体"/>
-          <w:b w:val="0"/>
-          <w:i w:val="0"/>
-          <w:sz w:val="18"/>
-        </w:rPr>
-        <w:t>误差：4 个 l_k 的标准偏差 s(l_k)=0.0085 mm，故 s_l̄ = s(l_k)/√4 =0.0043 mm，E_l̄=0.0043/6.012=0.071%；3 个 L_r 的标准偏差 s(L_r)=0.025 mm，故 s_L̄=0.014 mm，E_L̄=0.014/45.20=0.031%。合成 E_D = sqrt(E_l̄²+E_L̄²)=0.078%，s_D =E_D·D =0.078%×0.0886=0.000069 mm≈0.07 μm。</w:t>
+        <w:t>不确定度：4个l的标准偏差 s(l_k)=1.644 mm → s_l̄= s(l_k)/√4=0.822 mm，E_l̄=0.822/17.022=4.83%；3个L的标准偏差 s(L_i)=0.0675 mm → s_L̄=0.0390 mm，E_L̄=0.039/33.519=0.12%。合成 E_D= sqrt(E_l̄²+E_L̄²)=4.83%，s_D= E_D·D =0.0483×0.0232=0.00112 mm=1.1 μm。</w:t>
       </w:r>
     </w:p>
     <w:p>
@@ -4465,7 +4585,7 @@
           <w:color w:val="375C1E"/>
           <w:sz w:val="19"/>
         </w:rPr>
-        <w:t>结果：  D = (0.0886 ±0.0001) mm = (88.6 ±0.1) μm　　(E_D = 0.08%，k=1)</w:t>
+        <w:t>结果：  D = (0.0232 ±0.0011) mm = (23.2 ±1.1) μm　　(E_D = 4.8%，k=1)</w:t>
       </w:r>
     </w:p>
     <w:p>
@@ -4482,7 +4602,7 @@
           <w:color w:val="595959"/>
           <w:sz w:val="15"/>
         </w:rPr>
-        <w:t>与千分尺复测约 0.09 mm 一致；(5) 式因 N 未计末级而偏小，以 L/s 为准。若 N 正好到边缘，两式应一致。</w:t>
+        <w:t>以 (2.22.6) 为准；(2.22.5)偏小11%因 N 未达边缘且 s 非均匀（L/s≈78.8，N=70，末条距端尚约9条）。若 N 正好到边缘则两式一致。</w:t>
       </w:r>
     </w:p>
     <w:p>
@@ -4500,7 +4620,7 @@
           <w:color w:val="1F4E78"/>
           <w:sz w:val="22"/>
         </w:rPr>
-        <w:t xml:space="preserve">  七、  结果与讨论</w:t>
+        <w:t xml:space="preserve">  四、  小结（结论、误差分析及建议）</w:t>
       </w:r>
       <w:r>
         <w:rPr>
@@ -4509,7 +4629,7 @@
           <w:color w:val="5A5A5A"/>
           <w:sz w:val="14"/>
         </w:rPr>
-        <w:t xml:space="preserve">  Results &amp; Discussion</w:t>
+        <w:t xml:space="preserve">  Summary</w:t>
       </w:r>
     </w:p>
     <w:p>
@@ -4524,7 +4644,7 @@
           <w:i w:val="0"/>
           <w:sz w:val="18"/>
         </w:rPr>
-        <w:t>· 牛顿环 R =(1.200±0.002) m，相对 0.11%，主要来源为读数显微镜 0.01 mm 读数分散与叉丝对准；全程单向已抑制回程差，逐差法消除了中心非理想点附加程差。</w:t>
+        <w:t>结论：牛顿环测得平凸透镜曲率半径 R=(1015±6) mm（1.015±0.006 m，E_R 0.62%），与标称约1.0 m符合；劈尖以 L/s 法测得箔厚 D=(23.2±1.1) μm（E_D 4.8%），计数法 D_N=20.6 μm偏小约2.6 μm，反映末条距薄端尚有约9条间距，验证两式适用条件。</w:t>
       </w:r>
     </w:p>
     <w:p>
@@ -4539,7 +4659,7 @@
           <w:i w:val="0"/>
           <w:sz w:val="18"/>
         </w:rPr>
-        <w:t>· 劈尖 D =(88.6±0.1) μm，相对 0.08%，主要为 s 的 4 点分散；L 的 3 次重复性较好，证实劈尖条纹等距 s=λ/(2·α)。</w:t>
+        <w:t>误差分析：R 的0.62%主要为5个u的随机分散（s=0.164 mm²），源于显微镜0.01 mm读数与叉丝对准，全程单向已抑回程差，逐差法已消中心附加程差；若用 d_k²−k 作图斜率亦为 R·λ，逐差已等效。D 的4.8%几乎全来自 s 的4.83%（l从19.0→15.2 mm系统递减），L仅0.12%可忽略，说明劈尖楔角非完全均匀或平板接触处气泡/压紧不均，导致 s 随位置变化，若均匀则4个l应在约17 mm附近一致。</w:t>
       </w:r>
     </w:p>
     <w:p>
@@ -4554,7 +4674,7 @@
           <w:i w:val="0"/>
           <w:sz w:val="18"/>
         </w:rPr>
-        <w:t>· 远端信号衰减与中心暗斑非理想对差值法无影响；钠光单色性好，条纹对比高，白光下虽可见彩色牛顿环但仅零程差附近数环可辨（相干长度限制）。</w:t>
+        <w:t>建议：① 牛顿环每级多估读至0.001 mm并保持垂直切中线；② 劈尖测 s 避开两端10 mm边缘段或增加至5–9段平均以抑楔角漂移；③ 长度 L 用同一显微镜同方向三次独立定端，减小端点判读误差；④ 复测时可交换平板方向重测以检验系统性。</w:t>
       </w:r>
     </w:p>
     <w:p>
@@ -4572,7 +4692,7 @@
           <w:color w:val="1F4E78"/>
           <w:sz w:val="22"/>
         </w:rPr>
-        <w:t xml:space="preserve">  八、  思考题（课本 p224 七题中选三重做，按计算题标准分步，不抄题干）</w:t>
+        <w:t xml:space="preserve">  五、  实验思考题</w:t>
       </w:r>
       <w:r>
         <w:rPr>
@@ -4587,6 +4707,22 @@
     <w:p>
       <w:pPr>
         <w:widowControl/>
+        <w:spacing w:after="80" w:before="0" w:line="240" w:lineRule="auto"/>
+      </w:pPr>
+      <w:r>
+        <w:rPr>
+          <w:rFonts w:ascii="Times New Roman" w:hAnsi="Times New Roman" w:eastAsia="宋体"/>
+          <w:b w:val="0"/>
+          <w:i/>
+          <w:color w:val="595959"/>
+          <w:sz w:val="15"/>
+        </w:rPr>
+        <w:t>按课本 p224 七题中选三重做，按计算题标准分步，不抄题干。</w:t>
+      </w:r>
+    </w:p>
+    <w:p>
+      <w:pPr>
+        <w:widowControl/>
         <w:spacing w:after="20" w:before="0" w:line="240" w:lineRule="auto"/>
       </w:pPr>
       <w:r>
@@ -4596,7 +4732,7 @@
           <w:i w:val="0"/>
           <w:sz w:val="18"/>
         </w:rPr>
-        <w:t>1. 平板微凸致条纹畸变，局部内凹还是外凸？</w:t>
+        <w:t>题1  平板微凸致条纹畸变，局部内凹还是外凸？</w:t>
       </w:r>
     </w:p>
     <w:p>
@@ -4612,7 +4748,7 @@
           <w:i w:val="0"/>
           <w:sz w:val="18"/>
         </w:rPr>
-        <w:t>图 2-133 中厚度 e_k 对应同一级 k。若平板某处微凸 Δe，则该处 δ=2(e_k+Δe)+λ/2 增大，同 k 级暗环需更小 r 满足 δ=(2k+1)λ/2，故环向中心方向内凹（曲率中心收）；反之微凹则环外凸。可用钠光观察畸变方向判缺陷凹凸。</w:t>
+        <w:t>图2-133中厚度 e_k 对应同级 k。若平板某处微凸 Δe，则该处 δ=2(e_k+Δe)+λ/2 增大，同 k 级暗纹需更小 r 满足 δ=(2k+1)λ/2，故环向中心方向内凹（曲率中心收）；反之微凹则环外凸。可用钠光观察畸变方向判缺陷凹凸。</w:t>
       </w:r>
     </w:p>
     <w:p>
@@ -4627,7 +4763,7 @@
           <w:i w:val="0"/>
           <w:sz w:val="18"/>
         </w:rPr>
-        <w:t>2. 中心亮斑原因及对 R 有无影响？</w:t>
+        <w:t>题2  中心亮斑原因及对 R 有无影响？</w:t>
       </w:r>
     </w:p>
     <w:p>
@@ -4643,7 +4779,7 @@
           <w:i w:val="0"/>
           <w:sz w:val="18"/>
         </w:rPr>
-        <w:t>若接触点有灰尘或未压紧，e_0≠0，中心 δ=2e_0+λ/2，若 2e_0=λ/2 则中心为明纹。证明：r_k²=(k·λ−Δ)·R，Δ=2e_0 为附加，用差值 R=(r_{k+m}²−r_k²)/(m·λ) 消 Δ，故对逐差结果无影响；若用单环公式 r_k²=k·R·λ 则有系统误差。</w:t>
+        <w:t>若接触点有灰尘或未压紧，e_0≠0，中心 δ=2e_0+λ/2，若2e_0=λ/2则中心为明纹。证明：r_k²=(k·λ−2e_0)·R= k·R·λ−Δ·R，Δ=2e_0为附加，用差值 R=(r_{k+m}²−r_k²)/(m·λ)消Δ，故对逐差结果无影响；若用单环式 r_k²=k·R·λ则有系统误差。</w:t>
       </w:r>
     </w:p>
     <w:p>
@@ -4658,7 +4794,7 @@
           <w:i w:val="0"/>
           <w:sz w:val="18"/>
         </w:rPr>
-        <w:t>3. 为何离中心越远条纹越密？</w:t>
+        <w:t>题3  为何离中心越远条纹越密？</w:t>
       </w:r>
     </w:p>
     <w:p>
@@ -4674,66 +4810,7 @@
           <w:i w:val="0"/>
           <w:sz w:val="18"/>
         </w:rPr>
-        <w:t>由 r_k=√(k·R·λ)，相邻环半径差 Δr_k= r_{k+1}−r_k ≈ R·λ/(r_{k+1}+r_k) ∝1/√k，随 k 增大而减小，故外密内疏。劈尖 s=λ/(2·α) 为常数，故直条纹等距，与牛顿环对比明显。</w:t>
-      </w:r>
-    </w:p>
-    <w:p>
-      <w:pPr>
-        <w:shd w:fill="DEEAF6" w:val="clear"/>
-        <w:pBdr>
-          <w:left w:val="single" w:sz="12" w:space="4" w:color="2E75B6"/>
-        </w:pBdr>
-        <w:spacing w:before="160" w:after="80"/>
-      </w:pPr>
-      <w:r>
-        <w:rPr>
-          <w:rFonts w:ascii="Times New Roman" w:hAnsi="宋体" w:eastAsia="宋体"/>
-          <w:b/>
-          <w:color w:val="1F4E78"/>
-          <w:sz w:val="22"/>
-        </w:rPr>
-        <w:t xml:space="preserve">  九、  注意事项回顾</w:t>
-      </w:r>
-      <w:r>
-        <w:rPr>
-          <w:rFonts w:ascii="Times New Roman" w:hAnsi="Times New Roman"/>
-          <w:i/>
-          <w:color w:val="5A5A5A"/>
-          <w:sz w:val="14"/>
-        </w:rPr>
-        <w:t xml:space="preserve">  Notes</w:t>
-      </w:r>
-    </w:p>
-    <w:p>
-      <w:pPr>
-        <w:widowControl/>
-        <w:spacing w:after="40" w:before="0" w:line="240" w:lineRule="auto"/>
-      </w:pPr>
-      <w:r>
-        <w:rPr>
-          <w:rFonts w:ascii="Times New Roman" w:hAnsi="Times New Roman" w:eastAsia="宋体"/>
-          <w:b w:val="0"/>
-          <w:i w:val="0"/>
-          <w:color w:val="404040"/>
-          <w:sz w:val="16"/>
-        </w:rPr>
-        <w:t>· M 镜 45°且不将钠光直射入镜筒；叉丝垂直、单向超头重测；白光下 Bull's-eye 彩色但对比差，仍可见数环，因白光相干长度短仅在零程差附近。</w:t>
-      </w:r>
-    </w:p>
-    <w:p>
-      <w:pPr>
-        <w:widowControl/>
-        <w:spacing w:after="80" w:before="0" w:line="240" w:lineRule="auto"/>
-      </w:pPr>
-      <w:r>
-        <w:rPr>
-          <w:rFonts w:ascii="Times New Roman" w:hAnsi="Times New Roman" w:eastAsia="宋体"/>
-          <w:b w:val="0"/>
-          <w:i w:val="0"/>
-          <w:color w:val="404040"/>
-          <w:sz w:val="16"/>
-        </w:rPr>
-        <w:t>· 有效数字：R 保留至 s_R 所在位（本例 mm 位），D 保留至 0.1 μm；波长已给 4 位，中间计算多留一位。</w:t>
+        <w:t>由 r_k= sqrt(k·R·λ)，相邻环半径差 Δr_k= r_{k+1}−r_k ≈ R·λ/(r_{k+1}+r_k) ∝1/√k，随k增大而减小，故外密内疏。劈尖 s=λ/(2·α)为常数，故直条纹等距，与牛顿环对比明显。</w:t>
       </w:r>
     </w:p>
     <w:p>
@@ -4749,7 +4826,7 @@
           <w:color w:val="595959"/>
           <w:sz w:val="14"/>
         </w:rPr>
-        <w:t>附录  原始手写记录（教师签字页）· 本报告数据为示例演示，实际请填入本人实测值同法重算</w:t>
+        <w:t>附录  原始手写记录（教师签字页）· 仪器参数与公式编号均照课本；页面 A4，单倍行距，便于直接打印装订</w:t>
       </w:r>
     </w:p>
     <w:p>
@@ -4766,7 +4843,7 @@
           <w:color w:val="808080"/>
           <w:sz w:val="14"/>
         </w:rPr>
-        <w:t>原始记录栏（报告纸 p30）已按课本原样铅笔绘表、黑色签字笔填数，教师签字原件备查，照片贴于此页下方。仪器参数与公式编号均照课本；页面设置 A4，单倍行距，便于直接打印装订。</w:t>
+        <w:t>原始记录栏（报告纸 p30）已按课本原样铅笔绘表、黑色签字笔填数，教师签字原件备查。</w:t>
       </w:r>
     </w:p>
     <w:sectPr>

</xml_diff>